<commit_message>
Suppression de dossier + template 2 are added !
</commit_message>
<xml_diff>
--- a/src/main/resources/templates/Dossiertemplate.docx
+++ b/src/main/resources/templates/Dossiertemplate.docx
@@ -4,7 +4,7 @@
   <w:body>
     <w:p>
       <w:pPr>
-        <w:pStyle w:val="Titre3"/>
+        <w:pStyle w:val="Heading3"/>
         <w:spacing w:line="240" w:lineRule="auto"/>
         <w:ind w:hanging="11"/>
         <w:jc w:val="left"/>
@@ -16,7 +16,6 @@
           <w:rtl/>
         </w:rPr>
       </w:pPr>
-      <w:proofErr w:type="gramStart"/>
       <w:r>
         <w:rPr>
           <w:rFonts w:cs="Traditional Arabic" w:hint="cs"/>
@@ -25,18 +24,7 @@
           <w:u w:val="none"/>
           <w:rtl/>
         </w:rPr>
-        <w:t>عـــــــــــــــــدد :</w:t>
-      </w:r>
-      <w:proofErr w:type="gramEnd"/>
-      <w:r>
-        <w:rPr>
-          <w:rFonts w:cs="Traditional Arabic" w:hint="cs"/>
-          <w:sz w:val="36"/>
-          <w:szCs w:val="36"/>
-          <w:u w:val="none"/>
-          <w:rtl/>
-        </w:rPr>
-        <w:t xml:space="preserve"> </w:t>
+        <w:t xml:space="preserve">عـــــــــــــــــدد : </w:t>
       </w:r>
       <w:r>
         <w:rPr>
@@ -65,7 +53,7 @@
     </w:p>
     <w:p>
       <w:pPr>
-        <w:pStyle w:val="Titre3"/>
+        <w:pStyle w:val="Heading3"/>
         <w:spacing w:line="240" w:lineRule="auto"/>
         <w:rPr>
           <w:rFonts w:ascii="Traditional Arabic" w:hAnsi="Traditional Arabic" w:cs="Traditional Arabic"/>
@@ -108,7 +96,7 @@
     </w:p>
     <w:p>
       <w:pPr>
-        <w:pStyle w:val="Titre3"/>
+        <w:pStyle w:val="Heading3"/>
         <w:spacing w:line="240" w:lineRule="auto"/>
         <w:ind w:hanging="11"/>
         <w:rPr>
@@ -617,7 +605,7 @@
     </w:p>
     <w:tbl>
       <w:tblPr>
-        <w:tblStyle w:val="Grilledutableau"/>
+        <w:tblStyle w:val="TableGrid"/>
         <w:bidiVisual/>
         <w:tblW w:w="10496" w:type="dxa"/>
         <w:tblInd w:w="-9" w:type="dxa"/>
@@ -729,7 +717,6 @@
                 <w:lang w:val="fr-FR" w:bidi="ar-MA"/>
               </w:rPr>
             </w:pPr>
-            <w:proofErr w:type="gramStart"/>
             <w:r>
               <w:rPr>
                 <w:rFonts w:asciiTheme="minorBidi" w:hAnsiTheme="minorBidi" w:cstheme="minorBidi"/>
@@ -739,7 +726,6 @@
               </w:rPr>
               <w:t>F.N</w:t>
             </w:r>
-            <w:proofErr w:type="gramEnd"/>
           </w:p>
         </w:tc>
         <w:tc>
@@ -2829,8 +2815,12 @@
       </w:pPr>
     </w:p>
     <w:sectPr>
-      <w:headerReference w:type="default" r:id="rId8"/>
-      <w:headerReference w:type="first" r:id="rId9"/>
+      <w:headerReference w:type="even" r:id="rId8"/>
+      <w:headerReference w:type="default" r:id="rId9"/>
+      <w:footerReference w:type="even" r:id="rId10"/>
+      <w:footerReference w:type="default" r:id="rId11"/>
+      <w:headerReference w:type="first" r:id="rId12"/>
+      <w:footerReference w:type="first" r:id="rId13"/>
       <w:pgSz w:w="11906" w:h="16838"/>
       <w:pgMar w:top="993" w:right="851" w:bottom="540" w:left="851" w:header="284" w:footer="539" w:gutter="0"/>
       <w:pgNumType w:start="1"/>
@@ -2863,6 +2853,36 @@
 </w:endnotes>
 </file>
 
+<file path=word/footer1.xml><?xml version="1.0" encoding="utf-8"?>
+<w:ftr xmlns:wpc="http://schemas.microsoft.com/office/word/2010/wordprocessingCanvas" xmlns:cx="http://schemas.microsoft.com/office/drawing/2014/chartex" xmlns:cx1="http://schemas.microsoft.com/office/drawing/2015/9/8/chartex" xmlns:cx2="http://schemas.microsoft.com/office/drawing/2015/10/21/chartex" xmlns:cx3="http://schemas.microsoft.com/office/drawing/2016/5/9/chartex" xmlns:cx4="http://schemas.microsoft.com/office/drawing/2016/5/10/chartex" xmlns:cx5="http://schemas.microsoft.com/office/drawing/2016/5/11/chartex" xmlns:cx6="http://schemas.microsoft.com/office/drawing/2016/5/12/chartex" xmlns:cx7="http://schemas.microsoft.com/office/drawing/2016/5/13/chartex" xmlns:cx8="http://schemas.microsoft.com/office/drawing/2016/5/14/chartex" xmlns:mc="http://schemas.openxmlformats.org/markup-compatibility/2006" xmlns:aink="http://schemas.microsoft.com/office/drawing/2016/ink" xmlns:am3d="http://schemas.microsoft.com/office/drawing/2017/model3d" xmlns:o="urn:schemas-microsoft-com:office:office" xmlns:oel="http://schemas.microsoft.com/office/2019/extlst" xmlns:r="http://schemas.openxmlformats.org/officeDocument/2006/relationships" xmlns:m="http://schemas.openxmlformats.org/officeDocument/2006/math" xmlns:v="urn:schemas-microsoft-com:vml" xmlns:wp14="http://schemas.microsoft.com/office/word/2010/wordprocessingDrawing" xmlns:wp="http://schemas.openxmlformats.org/drawingml/2006/wordprocessingDrawing" xmlns:w10="urn:schemas-microsoft-com:office:word" xmlns:w="http://schemas.openxmlformats.org/wordprocessingml/2006/main" xmlns:w14="http://schemas.microsoft.com/office/word/2010/wordml" xmlns:w15="http://schemas.microsoft.com/office/word/2012/wordml" xmlns:w16cei="http://schemas.microsoft.com/office/word/2026/wordml/cei" xmlns:w16cex="http://schemas.microsoft.com/office/word/2018/wordml/cex" xmlns:w16cid="http://schemas.microsoft.com/office/word/2016/wordml/cid" xmlns:w16="http://schemas.microsoft.com/office/word/2018/wordml" xmlns:w16du="http://schemas.microsoft.com/office/word/2023/wordml/word16du" xmlns:w16sdtdh="http://schemas.microsoft.com/office/word/2020/wordml/sdtdatahash" xmlns:w16sdtfl="http://schemas.microsoft.com/office/word/2024/wordml/sdtformatlock" xmlns:w16se="http://schemas.microsoft.com/office/word/2015/wordml/symex" xmlns:wpg="http://schemas.microsoft.com/office/word/2010/wordprocessingGroup" xmlns:wpi="http://schemas.microsoft.com/office/word/2010/wordprocessingInk" xmlns:wne="http://schemas.microsoft.com/office/word/2006/wordml" xmlns:wps="http://schemas.microsoft.com/office/word/2010/wordprocessingShape" mc:Ignorable="w14 w15 w16se w16cid w16 w16cex w16sdtdh w16sdtfl w16du wp14">
+  <w:p>
+    <w:pPr>
+      <w:pStyle w:val="Footer"/>
+    </w:pPr>
+  </w:p>
+</w:ftr>
+</file>
+
+<file path=word/footer2.xml><?xml version="1.0" encoding="utf-8"?>
+<w:ftr xmlns:wpc="http://schemas.microsoft.com/office/word/2010/wordprocessingCanvas" xmlns:cx="http://schemas.microsoft.com/office/drawing/2014/chartex" xmlns:cx1="http://schemas.microsoft.com/office/drawing/2015/9/8/chartex" xmlns:cx2="http://schemas.microsoft.com/office/drawing/2015/10/21/chartex" xmlns:cx3="http://schemas.microsoft.com/office/drawing/2016/5/9/chartex" xmlns:cx4="http://schemas.microsoft.com/office/drawing/2016/5/10/chartex" xmlns:cx5="http://schemas.microsoft.com/office/drawing/2016/5/11/chartex" xmlns:cx6="http://schemas.microsoft.com/office/drawing/2016/5/12/chartex" xmlns:cx7="http://schemas.microsoft.com/office/drawing/2016/5/13/chartex" xmlns:cx8="http://schemas.microsoft.com/office/drawing/2016/5/14/chartex" xmlns:mc="http://schemas.openxmlformats.org/markup-compatibility/2006" xmlns:aink="http://schemas.microsoft.com/office/drawing/2016/ink" xmlns:am3d="http://schemas.microsoft.com/office/drawing/2017/model3d" xmlns:o="urn:schemas-microsoft-com:office:office" xmlns:oel="http://schemas.microsoft.com/office/2019/extlst" xmlns:r="http://schemas.openxmlformats.org/officeDocument/2006/relationships" xmlns:m="http://schemas.openxmlformats.org/officeDocument/2006/math" xmlns:v="urn:schemas-microsoft-com:vml" xmlns:wp14="http://schemas.microsoft.com/office/word/2010/wordprocessingDrawing" xmlns:wp="http://schemas.openxmlformats.org/drawingml/2006/wordprocessingDrawing" xmlns:w10="urn:schemas-microsoft-com:office:word" xmlns:w="http://schemas.openxmlformats.org/wordprocessingml/2006/main" xmlns:w14="http://schemas.microsoft.com/office/word/2010/wordml" xmlns:w15="http://schemas.microsoft.com/office/word/2012/wordml" xmlns:w16cei="http://schemas.microsoft.com/office/word/2026/wordml/cei" xmlns:w16cex="http://schemas.microsoft.com/office/word/2018/wordml/cex" xmlns:w16cid="http://schemas.microsoft.com/office/word/2016/wordml/cid" xmlns:w16="http://schemas.microsoft.com/office/word/2018/wordml" xmlns:w16du="http://schemas.microsoft.com/office/word/2023/wordml/word16du" xmlns:w16sdtdh="http://schemas.microsoft.com/office/word/2020/wordml/sdtdatahash" xmlns:w16sdtfl="http://schemas.microsoft.com/office/word/2024/wordml/sdtformatlock" xmlns:w16se="http://schemas.microsoft.com/office/word/2015/wordml/symex" xmlns:wpg="http://schemas.microsoft.com/office/word/2010/wordprocessingGroup" xmlns:wpi="http://schemas.microsoft.com/office/word/2010/wordprocessingInk" xmlns:wne="http://schemas.microsoft.com/office/word/2006/wordml" xmlns:wps="http://schemas.microsoft.com/office/word/2010/wordprocessingShape" mc:Ignorable="w14 w15 w16se w16cid w16 w16cex w16sdtdh w16sdtfl w16du wp14">
+  <w:p>
+    <w:pPr>
+      <w:pStyle w:val="Footer"/>
+    </w:pPr>
+  </w:p>
+</w:ftr>
+</file>
+
+<file path=word/footer3.xml><?xml version="1.0" encoding="utf-8"?>
+<w:ftr xmlns:wpc="http://schemas.microsoft.com/office/word/2010/wordprocessingCanvas" xmlns:cx="http://schemas.microsoft.com/office/drawing/2014/chartex" xmlns:cx1="http://schemas.microsoft.com/office/drawing/2015/9/8/chartex" xmlns:cx2="http://schemas.microsoft.com/office/drawing/2015/10/21/chartex" xmlns:cx3="http://schemas.microsoft.com/office/drawing/2016/5/9/chartex" xmlns:cx4="http://schemas.microsoft.com/office/drawing/2016/5/10/chartex" xmlns:cx5="http://schemas.microsoft.com/office/drawing/2016/5/11/chartex" xmlns:cx6="http://schemas.microsoft.com/office/drawing/2016/5/12/chartex" xmlns:cx7="http://schemas.microsoft.com/office/drawing/2016/5/13/chartex" xmlns:cx8="http://schemas.microsoft.com/office/drawing/2016/5/14/chartex" xmlns:mc="http://schemas.openxmlformats.org/markup-compatibility/2006" xmlns:aink="http://schemas.microsoft.com/office/drawing/2016/ink" xmlns:am3d="http://schemas.microsoft.com/office/drawing/2017/model3d" xmlns:o="urn:schemas-microsoft-com:office:office" xmlns:oel="http://schemas.microsoft.com/office/2019/extlst" xmlns:r="http://schemas.openxmlformats.org/officeDocument/2006/relationships" xmlns:m="http://schemas.openxmlformats.org/officeDocument/2006/math" xmlns:v="urn:schemas-microsoft-com:vml" xmlns:wp14="http://schemas.microsoft.com/office/word/2010/wordprocessingDrawing" xmlns:wp="http://schemas.openxmlformats.org/drawingml/2006/wordprocessingDrawing" xmlns:w10="urn:schemas-microsoft-com:office:word" xmlns:w="http://schemas.openxmlformats.org/wordprocessingml/2006/main" xmlns:w14="http://schemas.microsoft.com/office/word/2010/wordml" xmlns:w15="http://schemas.microsoft.com/office/word/2012/wordml" xmlns:w16cei="http://schemas.microsoft.com/office/word/2026/wordml/cei" xmlns:w16cex="http://schemas.microsoft.com/office/word/2018/wordml/cex" xmlns:w16cid="http://schemas.microsoft.com/office/word/2016/wordml/cid" xmlns:w16="http://schemas.microsoft.com/office/word/2018/wordml" xmlns:w16du="http://schemas.microsoft.com/office/word/2023/wordml/word16du" xmlns:w16sdtdh="http://schemas.microsoft.com/office/word/2020/wordml/sdtdatahash" xmlns:w16sdtfl="http://schemas.microsoft.com/office/word/2024/wordml/sdtformatlock" xmlns:w16se="http://schemas.microsoft.com/office/word/2015/wordml/symex" xmlns:wpg="http://schemas.microsoft.com/office/word/2010/wordprocessingGroup" xmlns:wpi="http://schemas.microsoft.com/office/word/2010/wordprocessingInk" xmlns:wne="http://schemas.microsoft.com/office/word/2006/wordml" xmlns:wps="http://schemas.microsoft.com/office/word/2010/wordprocessingShape" mc:Ignorable="w14 w15 w16se w16cid w16 w16cex w16sdtdh w16sdtfl w16du wp14">
+  <w:p>
+    <w:pPr>
+      <w:pStyle w:val="Footer"/>
+    </w:pPr>
+  </w:p>
+</w:ftr>
+</file>
+
 <file path=word/footnotes.xml><?xml version="1.0" encoding="utf-8"?>
 <w:footnotes xmlns:wpc="http://schemas.microsoft.com/office/word/2010/wordprocessingCanvas" xmlns:cx="http://schemas.microsoft.com/office/drawing/2014/chartex" xmlns:cx1="http://schemas.microsoft.com/office/drawing/2015/9/8/chartex" xmlns:cx2="http://schemas.microsoft.com/office/drawing/2015/10/21/chartex" xmlns:cx3="http://schemas.microsoft.com/office/drawing/2016/5/9/chartex" xmlns:cx4="http://schemas.microsoft.com/office/drawing/2016/5/10/chartex" xmlns:cx5="http://schemas.microsoft.com/office/drawing/2016/5/11/chartex" xmlns:cx6="http://schemas.microsoft.com/office/drawing/2016/5/12/chartex" xmlns:cx7="http://schemas.microsoft.com/office/drawing/2016/5/13/chartex" xmlns:cx8="http://schemas.microsoft.com/office/drawing/2016/5/14/chartex" xmlns:mc="http://schemas.openxmlformats.org/markup-compatibility/2006" xmlns:aink="http://schemas.microsoft.com/office/drawing/2016/ink" xmlns:am3d="http://schemas.microsoft.com/office/drawing/2017/model3d" xmlns:o="urn:schemas-microsoft-com:office:office" xmlns:oel="http://schemas.microsoft.com/office/2019/extlst" xmlns:r="http://schemas.openxmlformats.org/officeDocument/2006/relationships" xmlns:m="http://schemas.openxmlformats.org/officeDocument/2006/math" xmlns:v="urn:schemas-microsoft-com:vml" xmlns:wp14="http://schemas.microsoft.com/office/word/2010/wordprocessingDrawing" xmlns:wp="http://schemas.openxmlformats.org/drawingml/2006/wordprocessingDrawing" xmlns:w10="urn:schemas-microsoft-com:office:word" xmlns:w="http://schemas.openxmlformats.org/wordprocessingml/2006/main" xmlns:w14="http://schemas.microsoft.com/office/word/2010/wordml" xmlns:w15="http://schemas.microsoft.com/office/word/2012/wordml" xmlns:w16cei="http://schemas.microsoft.com/office/word/2026/wordml/cei" xmlns:w16cex="http://schemas.microsoft.com/office/word/2018/wordml/cex" xmlns:w16cid="http://schemas.microsoft.com/office/word/2016/wordml/cid" xmlns:w16="http://schemas.microsoft.com/office/word/2018/wordml" xmlns:w16du="http://schemas.microsoft.com/office/word/2023/wordml/word16du" xmlns:w16sdtdh="http://schemas.microsoft.com/office/word/2020/wordml/sdtdatahash" xmlns:w16sdtfl="http://schemas.microsoft.com/office/word/2024/wordml/sdtformatlock" xmlns:w16se="http://schemas.microsoft.com/office/word/2015/wordml/symex" xmlns:wpg="http://schemas.microsoft.com/office/word/2010/wordprocessingGroup" xmlns:wpi="http://schemas.microsoft.com/office/word/2010/wordprocessingInk" xmlns:wne="http://schemas.microsoft.com/office/word/2006/wordml" xmlns:wps="http://schemas.microsoft.com/office/word/2010/wordprocessingShape" mc:Ignorable="w14 w15 w16se w16cid w16 w16cex w16sdtdh w16sdtfl w16du wp14">
   <w:footnote w:type="separator" w:id="-1">
@@ -2886,7 +2906,17 @@
 <w:hdr xmlns:wpc="http://schemas.microsoft.com/office/word/2010/wordprocessingCanvas" xmlns:cx="http://schemas.microsoft.com/office/drawing/2014/chartex" xmlns:cx1="http://schemas.microsoft.com/office/drawing/2015/9/8/chartex" xmlns:cx2="http://schemas.microsoft.com/office/drawing/2015/10/21/chartex" xmlns:cx3="http://schemas.microsoft.com/office/drawing/2016/5/9/chartex" xmlns:cx4="http://schemas.microsoft.com/office/drawing/2016/5/10/chartex" xmlns:cx5="http://schemas.microsoft.com/office/drawing/2016/5/11/chartex" xmlns:cx6="http://schemas.microsoft.com/office/drawing/2016/5/12/chartex" xmlns:cx7="http://schemas.microsoft.com/office/drawing/2016/5/13/chartex" xmlns:cx8="http://schemas.microsoft.com/office/drawing/2016/5/14/chartex" xmlns:mc="http://schemas.openxmlformats.org/markup-compatibility/2006" xmlns:aink="http://schemas.microsoft.com/office/drawing/2016/ink" xmlns:am3d="http://schemas.microsoft.com/office/drawing/2017/model3d" xmlns:o="urn:schemas-microsoft-com:office:office" xmlns:oel="http://schemas.microsoft.com/office/2019/extlst" xmlns:r="http://schemas.openxmlformats.org/officeDocument/2006/relationships" xmlns:m="http://schemas.openxmlformats.org/officeDocument/2006/math" xmlns:v="urn:schemas-microsoft-com:vml" xmlns:wp14="http://schemas.microsoft.com/office/word/2010/wordprocessingDrawing" xmlns:wp="http://schemas.openxmlformats.org/drawingml/2006/wordprocessingDrawing" xmlns:w10="urn:schemas-microsoft-com:office:word" xmlns:w="http://schemas.openxmlformats.org/wordprocessingml/2006/main" xmlns:w14="http://schemas.microsoft.com/office/word/2010/wordml" xmlns:w15="http://schemas.microsoft.com/office/word/2012/wordml" xmlns:w16cei="http://schemas.microsoft.com/office/word/2026/wordml/cei" xmlns:w16cex="http://schemas.microsoft.com/office/word/2018/wordml/cex" xmlns:w16cid="http://schemas.microsoft.com/office/word/2016/wordml/cid" xmlns:w16="http://schemas.microsoft.com/office/word/2018/wordml" xmlns:w16du="http://schemas.microsoft.com/office/word/2023/wordml/word16du" xmlns:w16sdtdh="http://schemas.microsoft.com/office/word/2020/wordml/sdtdatahash" xmlns:w16sdtfl="http://schemas.microsoft.com/office/word/2024/wordml/sdtformatlock" xmlns:w16se="http://schemas.microsoft.com/office/word/2015/wordml/symex" xmlns:wpg="http://schemas.microsoft.com/office/word/2010/wordprocessingGroup" xmlns:wpi="http://schemas.microsoft.com/office/word/2010/wordprocessingInk" xmlns:wne="http://schemas.microsoft.com/office/word/2006/wordml" xmlns:wps="http://schemas.microsoft.com/office/word/2010/wordprocessingShape" mc:Ignorable="w14 w15 w16se w16cid w16 w16cex w16sdtdh w16sdtfl w16du wp14">
   <w:p>
     <w:pPr>
-      <w:pStyle w:val="Titre3"/>
+      <w:pStyle w:val="Header"/>
+    </w:pPr>
+  </w:p>
+</w:hdr>
+</file>
+
+<file path=word/header2.xml><?xml version="1.0" encoding="utf-8"?>
+<w:hdr xmlns:wpc="http://schemas.microsoft.com/office/word/2010/wordprocessingCanvas" xmlns:cx="http://schemas.microsoft.com/office/drawing/2014/chartex" xmlns:cx1="http://schemas.microsoft.com/office/drawing/2015/9/8/chartex" xmlns:cx2="http://schemas.microsoft.com/office/drawing/2015/10/21/chartex" xmlns:cx3="http://schemas.microsoft.com/office/drawing/2016/5/9/chartex" xmlns:cx4="http://schemas.microsoft.com/office/drawing/2016/5/10/chartex" xmlns:cx5="http://schemas.microsoft.com/office/drawing/2016/5/11/chartex" xmlns:cx6="http://schemas.microsoft.com/office/drawing/2016/5/12/chartex" xmlns:cx7="http://schemas.microsoft.com/office/drawing/2016/5/13/chartex" xmlns:cx8="http://schemas.microsoft.com/office/drawing/2016/5/14/chartex" xmlns:mc="http://schemas.openxmlformats.org/markup-compatibility/2006" xmlns:aink="http://schemas.microsoft.com/office/drawing/2016/ink" xmlns:am3d="http://schemas.microsoft.com/office/drawing/2017/model3d" xmlns:o="urn:schemas-microsoft-com:office:office" xmlns:oel="http://schemas.microsoft.com/office/2019/extlst" xmlns:r="http://schemas.openxmlformats.org/officeDocument/2006/relationships" xmlns:m="http://schemas.openxmlformats.org/officeDocument/2006/math" xmlns:v="urn:schemas-microsoft-com:vml" xmlns:wp14="http://schemas.microsoft.com/office/word/2010/wordprocessingDrawing" xmlns:wp="http://schemas.openxmlformats.org/drawingml/2006/wordprocessingDrawing" xmlns:w10="urn:schemas-microsoft-com:office:word" xmlns:w="http://schemas.openxmlformats.org/wordprocessingml/2006/main" xmlns:w14="http://schemas.microsoft.com/office/word/2010/wordml" xmlns:w15="http://schemas.microsoft.com/office/word/2012/wordml" xmlns:w16cei="http://schemas.microsoft.com/office/word/2026/wordml/cei" xmlns:w16cex="http://schemas.microsoft.com/office/word/2018/wordml/cex" xmlns:w16cid="http://schemas.microsoft.com/office/word/2016/wordml/cid" xmlns:w16="http://schemas.microsoft.com/office/word/2018/wordml" xmlns:w16du="http://schemas.microsoft.com/office/word/2023/wordml/word16du" xmlns:w16sdtdh="http://schemas.microsoft.com/office/word/2020/wordml/sdtdatahash" xmlns:w16sdtfl="http://schemas.microsoft.com/office/word/2024/wordml/sdtformatlock" xmlns:w16se="http://schemas.microsoft.com/office/word/2015/wordml/symex" xmlns:wpg="http://schemas.microsoft.com/office/word/2010/wordprocessingGroup" xmlns:wpi="http://schemas.microsoft.com/office/word/2010/wordprocessingInk" xmlns:wne="http://schemas.microsoft.com/office/word/2006/wordml" xmlns:wps="http://schemas.microsoft.com/office/word/2010/wordprocessingShape" mc:Ignorable="w14 w15 w16se w16cid w16 w16cex w16sdtdh w16sdtfl w16du wp14">
+  <w:p>
+    <w:pPr>
+      <w:pStyle w:val="Heading3"/>
       <w:spacing w:line="240" w:lineRule="auto"/>
       <w:ind w:right="6804"/>
       <w:rPr>
@@ -3039,7 +3069,7 @@
                       <w:txbxContent>
                         <w:p>
                           <w:pPr>
-                            <w:pStyle w:val="Titre3"/>
+                            <w:pStyle w:val="Heading3"/>
                             <w:ind w:hanging="11"/>
                             <w:jc w:val="left"/>
                             <w:rPr>
@@ -3088,7 +3118,7 @@
                 <w:txbxContent>
                   <w:p>
                     <w:pPr>
-                      <w:pStyle w:val="Titre3"/>
+                      <w:pStyle w:val="Heading3"/>
                       <w:ind w:hanging="11"/>
                       <w:jc w:val="left"/>
                       <w:rPr>
@@ -3129,7 +3159,7 @@
   </w:p>
   <w:p>
     <w:pPr>
-      <w:pStyle w:val="Titre3"/>
+      <w:pStyle w:val="Heading3"/>
       <w:spacing w:line="240" w:lineRule="auto"/>
       <w:ind w:right="6804"/>
       <w:rPr>
@@ -3153,7 +3183,7 @@
   </w:p>
   <w:p>
     <w:pPr>
-      <w:pStyle w:val="Titre3"/>
+      <w:pStyle w:val="Heading3"/>
       <w:spacing w:line="240" w:lineRule="auto"/>
       <w:ind w:right="6804"/>
       <w:rPr>
@@ -3164,7 +3194,6 @@
         <w:rtl/>
       </w:rPr>
     </w:pPr>
-    <w:proofErr w:type="gramStart"/>
     <w:r>
       <w:rPr>
         <w:rFonts w:cs="Traditional Arabic"/>
@@ -3175,7 +3204,6 @@
       </w:rPr>
       <w:t>المديرية  الإقليمية</w:t>
     </w:r>
-    <w:proofErr w:type="gramEnd"/>
     <w:r>
       <w:rPr>
         <w:rFonts w:cs="Traditional Arabic" w:hint="cs"/>
@@ -3189,7 +3217,7 @@
   </w:p>
   <w:p>
     <w:pPr>
-      <w:pStyle w:val="Titre3"/>
+      <w:pStyle w:val="Heading3"/>
       <w:spacing w:line="240" w:lineRule="auto"/>
       <w:ind w:right="6804"/>
       <w:rPr>
@@ -3213,300 +3241,15 @@
   </w:p>
   <w:p>
     <w:pPr>
-      <w:pStyle w:val="En-tte"/>
+      <w:pStyle w:val="Header"/>
     </w:pPr>
   </w:p>
 </w:hdr>
 </file>
 
-<file path=word/header2.xml><?xml version="1.0" encoding="utf-8"?>
+<file path=word/header3.xml><?xml version="1.0" encoding="utf-8"?>
 <w:hdr xmlns:wpc="http://schemas.microsoft.com/office/word/2010/wordprocessingCanvas" xmlns:cx="http://schemas.microsoft.com/office/drawing/2014/chartex" xmlns:cx1="http://schemas.microsoft.com/office/drawing/2015/9/8/chartex" xmlns:cx2="http://schemas.microsoft.com/office/drawing/2015/10/21/chartex" xmlns:cx3="http://schemas.microsoft.com/office/drawing/2016/5/9/chartex" xmlns:cx4="http://schemas.microsoft.com/office/drawing/2016/5/10/chartex" xmlns:cx5="http://schemas.microsoft.com/office/drawing/2016/5/11/chartex" xmlns:cx6="http://schemas.microsoft.com/office/drawing/2016/5/12/chartex" xmlns:cx7="http://schemas.microsoft.com/office/drawing/2016/5/13/chartex" xmlns:cx8="http://schemas.microsoft.com/office/drawing/2016/5/14/chartex" xmlns:mc="http://schemas.openxmlformats.org/markup-compatibility/2006" xmlns:aink="http://schemas.microsoft.com/office/drawing/2016/ink" xmlns:am3d="http://schemas.microsoft.com/office/drawing/2017/model3d" xmlns:o="urn:schemas-microsoft-com:office:office" xmlns:oel="http://schemas.microsoft.com/office/2019/extlst" xmlns:r="http://schemas.openxmlformats.org/officeDocument/2006/relationships" xmlns:m="http://schemas.openxmlformats.org/officeDocument/2006/math" xmlns:v="urn:schemas-microsoft-com:vml" xmlns:wp14="http://schemas.microsoft.com/office/word/2010/wordprocessingDrawing" xmlns:wp="http://schemas.openxmlformats.org/drawingml/2006/wordprocessingDrawing" xmlns:w10="urn:schemas-microsoft-com:office:word" xmlns:w="http://schemas.openxmlformats.org/wordprocessingml/2006/main" xmlns:w14="http://schemas.microsoft.com/office/word/2010/wordml" xmlns:w15="http://schemas.microsoft.com/office/word/2012/wordml" xmlns:w16cei="http://schemas.microsoft.com/office/word/2026/wordml/cei" xmlns:w16cex="http://schemas.microsoft.com/office/word/2018/wordml/cex" xmlns:w16cid="http://schemas.microsoft.com/office/word/2016/wordml/cid" xmlns:w16="http://schemas.microsoft.com/office/word/2018/wordml" xmlns:w16du="http://schemas.microsoft.com/office/word/2023/wordml/word16du" xmlns:w16sdtdh="http://schemas.microsoft.com/office/word/2020/wordml/sdtdatahash" xmlns:w16sdtfl="http://schemas.microsoft.com/office/word/2024/wordml/sdtformatlock" xmlns:w16se="http://schemas.microsoft.com/office/word/2015/wordml/symex" xmlns:wpg="http://schemas.microsoft.com/office/word/2010/wordprocessingGroup" xmlns:wpi="http://schemas.microsoft.com/office/word/2010/wordprocessingInk" xmlns:wne="http://schemas.microsoft.com/office/word/2006/wordml" xmlns:wps="http://schemas.microsoft.com/office/word/2010/wordprocessingShape" mc:Ignorable="w14 w15 w16se w16cid w16 w16cex w16sdtdh w16sdtfl w16du wp14">
   <w:p>
-    <w:pPr>
-      <w:pStyle w:val="Titre3"/>
-      <w:spacing w:line="240" w:lineRule="auto"/>
-      <w:ind w:right="6804"/>
-      <w:rPr>
-        <w:rFonts w:cs="Traditional Arabic"/>
-        <w:sz w:val="24"/>
-        <w:szCs w:val="24"/>
-        <w:u w:val="none"/>
-        <w:rtl/>
-      </w:rPr>
-    </w:pPr>
-    <w:r>
-      <w:rPr>
-        <w:rFonts w:cs="Traditional Arabic"/>
-        <w:noProof/>
-        <w:sz w:val="24"/>
-        <w:szCs w:val="24"/>
-        <w:u w:val="none"/>
-        <w:rtl/>
-        <w:lang w:eastAsia="en-US" w:bidi="ar-SA"/>
-      </w:rPr>
-      <mc:AlternateContent>
-        <mc:Choice Requires="wps">
-          <w:drawing>
-            <wp:anchor distT="0" distB="0" distL="114300" distR="114300" simplePos="0" relativeHeight="251659264" behindDoc="0" locked="0" layoutInCell="1" allowOverlap="1" wp14:anchorId="445B40A9" wp14:editId="51C648B4">
-              <wp:simplePos x="0" y="0"/>
-              <wp:positionH relativeFrom="column">
-                <wp:posOffset>-252385</wp:posOffset>
-              </wp:positionH>
-              <wp:positionV relativeFrom="paragraph">
-                <wp:posOffset>50060</wp:posOffset>
-              </wp:positionV>
-              <wp:extent cx="2294505" cy="662400"/>
-              <wp:effectExtent l="0" t="0" r="0" b="4445"/>
-              <wp:wrapNone/>
-              <wp:docPr id="2" name="Text Box 1"/>
-              <wp:cNvGraphicFramePr>
-                <a:graphicFrameLocks xmlns:a="http://schemas.openxmlformats.org/drawingml/2006/main"/>
-              </wp:cNvGraphicFramePr>
-              <a:graphic xmlns:a="http://schemas.openxmlformats.org/drawingml/2006/main">
-                <a:graphicData uri="http://schemas.microsoft.com/office/word/2010/wordprocessingShape">
-                  <wps:wsp>
-                    <wps:cNvSpPr txBox="1">
-                      <a:spLocks noChangeArrowheads="1"/>
-                    </wps:cNvSpPr>
-                    <wps:spPr bwMode="auto">
-                      <a:xfrm>
-                        <a:off x="0" y="0"/>
-                        <a:ext cx="2294505" cy="662400"/>
-                      </a:xfrm>
-                      <a:prstGeom prst="rect">
-                        <a:avLst/>
-                      </a:prstGeom>
-                      <a:noFill/>
-                      <a:ln>
-                        <a:noFill/>
-                      </a:ln>
-                      <a:extLst>
-                        <a:ext uri="{909E8E84-426E-40DD-AFC4-6F175D3DCCD1}">
-                          <a14:hiddenFill xmlns:a14="http://schemas.microsoft.com/office/drawing/2010/main">
-                            <a:solidFill>
-                              <a:srgbClr val="FFFFFF"/>
-                            </a:solidFill>
-                          </a14:hiddenFill>
-                        </a:ext>
-                        <a:ext uri="{91240B29-F687-4F45-9708-019B960494DF}">
-                          <a14:hiddenLine xmlns:a14="http://schemas.microsoft.com/office/drawing/2010/main" w="9525">
-                            <a:solidFill>
-                              <a:srgbClr val="000000"/>
-                            </a:solidFill>
-                            <a:miter lim="800000"/>
-                            <a:headEnd/>
-                            <a:tailEnd/>
-                          </a14:hiddenLine>
-                        </a:ext>
-                      </a:extLst>
-                    </wps:spPr>
-                    <wps:txbx>
-                      <w:txbxContent>
-                        <w:p>
-                          <w:pPr>
-                            <w:pStyle w:val="Titre3"/>
-                            <w:ind w:left="360"/>
-                            <w:rPr>
-                              <w:rFonts w:cs="Traditional Arabic"/>
-                              <w:lang w:val="fr-FR"/>
-                            </w:rPr>
-                          </w:pPr>
-                          <w:r>
-                            <w:rPr>
-                              <w:rFonts w:cs="Traditional Arabic" w:hint="cs"/>
-                              <w:sz w:val="24"/>
-                              <w:szCs w:val="24"/>
-                              <w:u w:val="none"/>
-                              <w:rtl/>
-                            </w:rPr>
-                            <w:t xml:space="preserve">الجديدة </w:t>
-                          </w:r>
-                          <w:proofErr w:type="gramStart"/>
-                          <w:r>
-                            <w:rPr>
-                              <w:rFonts w:cs="Traditional Arabic" w:hint="cs"/>
-                              <w:sz w:val="24"/>
-                              <w:szCs w:val="24"/>
-                              <w:u w:val="none"/>
-                              <w:rtl/>
-                            </w:rPr>
-                            <w:t>في :</w:t>
-                          </w:r>
-                          <w:proofErr w:type="gramEnd"/>
-                          <w:r>
-                            <w:rPr>
-                              <w:rFonts w:cs="Traditional Arabic" w:hint="cs"/>
-                              <w:sz w:val="24"/>
-                              <w:szCs w:val="24"/>
-                              <w:u w:val="none"/>
-                              <w:rtl/>
-                            </w:rPr>
-                            <w:t xml:space="preserve"> </w:t>
-                          </w:r>
-                          <w:r>
-                            <w:rPr>
-                              <w:rFonts w:cs="Traditional Arabic"/>
-                              <w:sz w:val="20"/>
-                              <w:szCs w:val="20"/>
-                              <w:u w:val="none"/>
-                              <w:lang w:val="fr-FR"/>
-                            </w:rPr>
-                            <w:t>{</w:t>
-                          </w:r>
-                          <w:proofErr w:type="spellStart"/>
-                          <w:r>
-                            <w:rPr>
-                              <w:rFonts w:cs="Traditional Arabic"/>
-                              <w:sz w:val="20"/>
-                              <w:szCs w:val="20"/>
-                              <w:u w:val="none"/>
-                              <w:lang w:val="fr-FR"/>
-                            </w:rPr>
-                            <w:t>dateCreation</w:t>
-                          </w:r>
-                          <w:proofErr w:type="spellEnd"/>
-                          <w:r>
-                            <w:rPr>
-                              <w:rFonts w:cs="Traditional Arabic"/>
-                              <w:sz w:val="20"/>
-                              <w:szCs w:val="20"/>
-                              <w:u w:val="none"/>
-                              <w:lang w:val="fr-FR"/>
-                            </w:rPr>
-                            <w:t>}</w:t>
-                          </w:r>
-                        </w:p>
-                        <w:p>
-                          <w:pPr>
-                            <w:pStyle w:val="Titre3"/>
-                            <w:jc w:val="left"/>
-                            <w:rPr>
-                              <w:rFonts w:cs="Traditional Arabic"/>
-                              <w:sz w:val="24"/>
-                              <w:szCs w:val="24"/>
-                              <w:u w:val="none"/>
-                            </w:rPr>
-                          </w:pPr>
-                        </w:p>
-                      </w:txbxContent>
-                    </wps:txbx>
-                    <wps:bodyPr rot="0" vert="horz" wrap="square" lIns="91440" tIns="45720" rIns="91440" bIns="45720" anchor="t" anchorCtr="0" upright="1">
-                      <a:noAutofit/>
-                    </wps:bodyPr>
-                  </wps:wsp>
-                </a:graphicData>
-              </a:graphic>
-              <wp14:sizeRelH relativeFrom="margin">
-                <wp14:pctWidth>0</wp14:pctWidth>
-              </wp14:sizeRelH>
-              <wp14:sizeRelV relativeFrom="margin">
-                <wp14:pctHeight>0</wp14:pctHeight>
-              </wp14:sizeRelV>
-            </wp:anchor>
-          </w:drawing>
-        </mc:Choice>
-        <mc:Fallback>
-          <w:pict>
-            <v:shapetype w14:anchorId="445B40A9" id="_x0000_t202" coordsize="21600,21600" o:spt="202" path="m,l,21600r21600,l21600,xe">
-              <v:stroke joinstyle="miter"/>
-              <v:path gradientshapeok="t" o:connecttype="rect"/>
-            </v:shapetype>
-            <v:shape id="_x0000_s1027" type="#_x0000_t202" style="position:absolute;left:0;text-align:left;margin-left:-19.85pt;margin-top:3.95pt;width:180.65pt;height:52.15pt;z-index:251659264;visibility:visible;mso-wrap-style:square;mso-width-percent:0;mso-height-percent:0;mso-wrap-distance-left:9pt;mso-wrap-distance-top:0;mso-wrap-distance-right:9pt;mso-wrap-distance-bottom:0;mso-position-horizontal:absolute;mso-position-horizontal-relative:text;mso-position-vertical:absolute;mso-position-vertical-relative:text;mso-width-percent:0;mso-height-percent:0;mso-width-relative:margin;mso-height-relative:margin;v-text-anchor:top" o:gfxdata="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" filled="f" stroked="f">
-              <v:textbox>
-                <w:txbxContent>
-                  <w:p>
-                    <w:pPr>
-                      <w:pStyle w:val="Titre3"/>
-                      <w:ind w:left="360"/>
-                      <w:rPr>
-                        <w:rFonts w:cs="Traditional Arabic"/>
-                        <w:lang w:val="fr-FR"/>
-                      </w:rPr>
-                    </w:pPr>
-                    <w:r>
-                      <w:rPr>
-                        <w:rFonts w:cs="Traditional Arabic" w:hint="cs"/>
-                        <w:sz w:val="24"/>
-                        <w:szCs w:val="24"/>
-                        <w:u w:val="none"/>
-                        <w:rtl/>
-                      </w:rPr>
-                      <w:t xml:space="preserve">الجديدة </w:t>
-                    </w:r>
-                    <w:proofErr w:type="gramStart"/>
-                    <w:r>
-                      <w:rPr>
-                        <w:rFonts w:cs="Traditional Arabic" w:hint="cs"/>
-                        <w:sz w:val="24"/>
-                        <w:szCs w:val="24"/>
-                        <w:u w:val="none"/>
-                        <w:rtl/>
-                      </w:rPr>
-                      <w:t>في :</w:t>
-                    </w:r>
-                    <w:proofErr w:type="gramEnd"/>
-                    <w:r>
-                      <w:rPr>
-                        <w:rFonts w:cs="Traditional Arabic" w:hint="cs"/>
-                        <w:sz w:val="24"/>
-                        <w:szCs w:val="24"/>
-                        <w:u w:val="none"/>
-                        <w:rtl/>
-                      </w:rPr>
-                      <w:t xml:space="preserve"> </w:t>
-                    </w:r>
-                    <w:r>
-                      <w:rPr>
-                        <w:rFonts w:cs="Traditional Arabic"/>
-                        <w:sz w:val="20"/>
-                        <w:szCs w:val="20"/>
-                        <w:u w:val="none"/>
-                        <w:lang w:val="fr-FR"/>
-                      </w:rPr>
-                      <w:t>{</w:t>
-                    </w:r>
-                    <w:proofErr w:type="spellStart"/>
-                    <w:r>
-                      <w:rPr>
-                        <w:rFonts w:cs="Traditional Arabic"/>
-                        <w:sz w:val="20"/>
-                        <w:szCs w:val="20"/>
-                        <w:u w:val="none"/>
-                        <w:lang w:val="fr-FR"/>
-                      </w:rPr>
-                      <w:t>dateCreation</w:t>
-                    </w:r>
-                    <w:proofErr w:type="spellEnd"/>
-                    <w:r>
-                      <w:rPr>
-                        <w:rFonts w:cs="Traditional Arabic"/>
-                        <w:sz w:val="20"/>
-                        <w:szCs w:val="20"/>
-                        <w:u w:val="none"/>
-                        <w:lang w:val="fr-FR"/>
-                      </w:rPr>
-                      <w:t>}</w:t>
-                    </w:r>
-                  </w:p>
-                  <w:p>
-                    <w:pPr>
-                      <w:pStyle w:val="Titre3"/>
-                      <w:jc w:val="left"/>
-                      <w:rPr>
-                        <w:rFonts w:cs="Traditional Arabic"/>
-                        <w:sz w:val="24"/>
-                        <w:szCs w:val="24"/>
-                        <w:u w:val="none"/>
-                      </w:rPr>
-                    </w:pPr>
-                  </w:p>
-                </w:txbxContent>
-              </v:textbox>
-            </v:shape>
-          </w:pict>
-        </mc:Fallback>
-      </mc:AlternateContent>
-    </w:r>
     <w:r>
       <w:rPr>
         <w:rFonts w:ascii="Traditional Arabic" w:hAnsi="Traditional Arabic" w:cs="Traditional Arabic"/>
@@ -3514,16 +3257,16 @@
         <w:sz w:val="40"/>
         <w:szCs w:val="40"/>
         <w:rtl/>
-        <w:lang w:eastAsia="en-US" w:bidi="ar-SA"/>
+        <w:lang w:eastAsia="en-US"/>
       </w:rPr>
       <w:drawing>
-        <wp:anchor distT="0" distB="0" distL="114300" distR="114300" simplePos="0" relativeHeight="251660288" behindDoc="0" locked="0" layoutInCell="1" allowOverlap="1" wp14:anchorId="19352F3B" wp14:editId="525857BB">
+        <wp:anchor distT="0" distB="0" distL="114300" distR="114300" simplePos="0" relativeHeight="251660288" behindDoc="0" locked="0" layoutInCell="1" allowOverlap="1" wp14:anchorId="19352F3B" wp14:editId="04E73E7E">
           <wp:simplePos x="0" y="0"/>
           <wp:positionH relativeFrom="column">
-            <wp:posOffset>2787015</wp:posOffset>
+            <wp:posOffset>2748236</wp:posOffset>
           </wp:positionH>
           <wp:positionV relativeFrom="paragraph">
-            <wp:posOffset>-10795</wp:posOffset>
+            <wp:posOffset>157867</wp:posOffset>
           </wp:positionV>
           <wp:extent cx="795020" cy="818515"/>
           <wp:effectExtent l="0" t="0" r="5080" b="635"/>
@@ -3579,6 +3322,24 @@
         </wp:anchor>
       </w:drawing>
     </w:r>
+  </w:p>
+  <w:p>
+    <w:pPr>
+      <w:pStyle w:val="Heading3"/>
+      <w:tabs>
+        <w:tab w:val="clear" w:pos="1924"/>
+        <w:tab w:val="clear" w:pos="5344"/>
+        <w:tab w:val="clear" w:pos="5884"/>
+      </w:tabs>
+      <w:spacing w:line="240" w:lineRule="auto"/>
+      <w:ind w:left="6334" w:right="-810" w:hanging="7185"/>
+      <w:rPr>
+        <w:rFonts w:cs="Traditional Arabic"/>
+        <w:sz w:val="24"/>
+        <w:szCs w:val="24"/>
+        <w:u w:val="none"/>
+      </w:rPr>
+    </w:pPr>
     <w:r>
       <w:rPr>
         <w:rFonts w:cs="Traditional Arabic"/>
@@ -3592,9 +3353,14 @@
   </w:p>
   <w:p>
     <w:pPr>
-      <w:pStyle w:val="Titre3"/>
+      <w:pStyle w:val="Heading3"/>
+      <w:tabs>
+        <w:tab w:val="clear" w:pos="1924"/>
+        <w:tab w:val="right" w:pos="3544"/>
+        <w:tab w:val="center" w:pos="7504"/>
+      </w:tabs>
       <w:spacing w:line="240" w:lineRule="auto"/>
-      <w:ind w:right="6804"/>
+      <w:ind w:right="6660"/>
       <w:rPr>
         <w:rFonts w:cs="Traditional Arabic"/>
         <w:sz w:val="24"/>
@@ -3611,14 +3377,27 @@
         <w:u w:val="none"/>
         <w:rtl/>
       </w:rPr>
-      <w:t xml:space="preserve">وزارة العدل </w:t>
+      <w:t>وزارة العد</w:t>
+    </w:r>
+    <w:r>
+      <w:rPr>
+        <w:rFonts w:cs="Traditional Arabic" w:hint="cs"/>
+        <w:sz w:val="24"/>
+        <w:szCs w:val="24"/>
+        <w:u w:val="none"/>
+        <w:rtl/>
+      </w:rPr>
+      <w:t>ل</w:t>
     </w:r>
   </w:p>
   <w:p>
     <w:pPr>
-      <w:pStyle w:val="Titre3"/>
+      <w:pStyle w:val="Heading3"/>
+      <w:tabs>
+        <w:tab w:val="clear" w:pos="5884"/>
+      </w:tabs>
       <w:spacing w:line="240" w:lineRule="auto"/>
-      <w:ind w:right="6804"/>
+      <w:ind w:right="6840"/>
       <w:rPr>
         <w:rFonts w:cs="Traditional Arabic"/>
         <w:sz w:val="24"/>
@@ -3627,7 +3406,6 @@
         <w:rtl/>
       </w:rPr>
     </w:pPr>
-    <w:proofErr w:type="gramStart"/>
     <w:r>
       <w:rPr>
         <w:rFonts w:cs="Traditional Arabic"/>
@@ -3638,7 +3416,6 @@
       </w:rPr>
       <w:t>المديرية  الإقليمية</w:t>
     </w:r>
-    <w:proofErr w:type="gramEnd"/>
     <w:r>
       <w:rPr>
         <w:rFonts w:cs="Traditional Arabic" w:hint="cs"/>
@@ -3652,9 +3429,17 @@
   </w:p>
   <w:p>
     <w:pPr>
-      <w:pStyle w:val="Titre3"/>
+      <w:pStyle w:val="Heading3"/>
       <w:spacing w:line="240" w:lineRule="auto"/>
-      <w:ind w:right="6804"/>
+      <w:ind w:right="6840"/>
+      <w:rPr>
+        <w:rFonts w:cs="Traditional Arabic"/>
+        <w:sz w:val="24"/>
+        <w:szCs w:val="24"/>
+        <w:u w:val="none"/>
+      </w:rPr>
+    </w:pPr>
+    <w:r>
       <w:rPr>
         <w:rFonts w:cs="Traditional Arabic"/>
         <w:sz w:val="24"/>
@@ -3662,17 +3447,40 @@
         <w:u w:val="none"/>
         <w:rtl/>
       </w:rPr>
+      <w:t>بالجديدة</w:t>
+    </w:r>
+  </w:p>
+  <w:p>
+    <w:pPr>
+      <w:ind w:left="4174" w:firstLine="3150"/>
     </w:pPr>
     <w:r>
       <w:rPr>
-        <w:rFonts w:cs="Traditional Arabic"/>
-        <w:sz w:val="24"/>
-        <w:szCs w:val="24"/>
-        <w:u w:val="none"/>
+        <w:rFonts w:hint="cs"/>
         <w:rtl/>
       </w:rPr>
-      <w:t>بالجديدة</w:t>
+      <w:t xml:space="preserve">الجديدة في : </w:t>
     </w:r>
+    <w:r>
+      <w:t>{</w:t>
+    </w:r>
+    <w:proofErr w:type="spellStart"/>
+    <w:r>
+      <w:t>dateCreation</w:t>
+    </w:r>
+    <w:proofErr w:type="spellEnd"/>
+    <w:r>
+      <w:t>}</w:t>
+    </w:r>
+  </w:p>
+  <w:p>
+    <w:pPr>
+      <w:ind w:firstLine="5524"/>
+      <w:rPr>
+        <w:rtl/>
+        <w:lang w:bidi="ar-MA"/>
+      </w:rPr>
+    </w:pPr>
   </w:p>
 </w:hdr>
 </file>
@@ -4707,11 +4515,11 @@
       <w:lang w:eastAsia="ar-SA"/>
     </w:rPr>
   </w:style>
-  <w:style w:type="paragraph" w:styleId="Titre3">
+  <w:style w:type="paragraph" w:styleId="Heading3">
     <w:name w:val="heading 3"/>
     <w:basedOn w:val="Normal"/>
     <w:next w:val="Normal"/>
-    <w:link w:val="Titre3Car"/>
+    <w:link w:val="Heading3Char"/>
     <w:qFormat/>
     <w:rsid w:val="00BC685B"/>
     <w:pPr>
@@ -4734,12 +4542,13 @@
       <w:lang w:bidi="ar-MA"/>
     </w:rPr>
   </w:style>
-  <w:style w:type="character" w:default="1" w:styleId="Policepardfaut">
+  <w:style w:type="character" w:default="1" w:styleId="DefaultParagraphFont">
     <w:name w:val="Default Paragraph Font"/>
     <w:uiPriority w:val="1"/>
+    <w:semiHidden/>
     <w:unhideWhenUsed/>
   </w:style>
-  <w:style w:type="table" w:default="1" w:styleId="TableauNormal">
+  <w:style w:type="table" w:default="1" w:styleId="TableNormal">
     <w:name w:val="Normal Table"/>
     <w:uiPriority w:val="99"/>
     <w:semiHidden/>
@@ -4754,16 +4563,16 @@
       </w:tblCellMar>
     </w:tblPr>
   </w:style>
-  <w:style w:type="numbering" w:default="1" w:styleId="Aucuneliste">
+  <w:style w:type="numbering" w:default="1" w:styleId="NoList">
     <w:name w:val="No List"/>
     <w:uiPriority w:val="99"/>
     <w:semiHidden/>
     <w:unhideWhenUsed/>
   </w:style>
-  <w:style w:type="character" w:customStyle="1" w:styleId="Titre3Car">
-    <w:name w:val="Titre 3 Car"/>
-    <w:basedOn w:val="Policepardfaut"/>
-    <w:link w:val="Titre3"/>
+  <w:style w:type="character" w:customStyle="1" w:styleId="Heading3Char">
+    <w:name w:val="Heading 3 Char"/>
+    <w:basedOn w:val="DefaultParagraphFont"/>
+    <w:link w:val="Heading3"/>
     <w:rsid w:val="00BC685B"/>
     <w:rPr>
       <w:rFonts w:ascii="Times New Roman" w:eastAsia="Times New Roman" w:hAnsi="Times New Roman" w:cs="Times New Roman"/>
@@ -4775,10 +4584,10 @@
       <w:lang w:eastAsia="ar-SA" w:bidi="ar-MA"/>
     </w:rPr>
   </w:style>
-  <w:style w:type="paragraph" w:styleId="Textedebulles">
+  <w:style w:type="paragraph" w:styleId="BalloonText">
     <w:name w:val="Balloon Text"/>
     <w:basedOn w:val="Normal"/>
-    <w:link w:val="TextedebullesCar"/>
+    <w:link w:val="BalloonTextChar"/>
     <w:uiPriority w:val="99"/>
     <w:semiHidden/>
     <w:unhideWhenUsed/>
@@ -4789,10 +4598,10 @@
       <w:szCs w:val="16"/>
     </w:rPr>
   </w:style>
-  <w:style w:type="character" w:customStyle="1" w:styleId="TextedebullesCar">
-    <w:name w:val="Texte de bulles Car"/>
-    <w:basedOn w:val="Policepardfaut"/>
-    <w:link w:val="Textedebulles"/>
+  <w:style w:type="character" w:customStyle="1" w:styleId="BalloonTextChar">
+    <w:name w:val="Balloon Text Char"/>
+    <w:basedOn w:val="DefaultParagraphFont"/>
+    <w:link w:val="BalloonText"/>
     <w:uiPriority w:val="99"/>
     <w:semiHidden/>
     <w:rsid w:val="00BC685B"/>
@@ -4803,10 +4612,10 @@
       <w:lang w:eastAsia="ar-SA"/>
     </w:rPr>
   </w:style>
-  <w:style w:type="paragraph" w:styleId="En-tte">
+  <w:style w:type="paragraph" w:styleId="Header">
     <w:name w:val="header"/>
     <w:basedOn w:val="Normal"/>
-    <w:link w:val="En-tteCar"/>
+    <w:link w:val="HeaderChar"/>
     <w:uiPriority w:val="99"/>
     <w:unhideWhenUsed/>
     <w:rsid w:val="00E871BF"/>
@@ -4817,10 +4626,10 @@
       </w:tabs>
     </w:pPr>
   </w:style>
-  <w:style w:type="character" w:customStyle="1" w:styleId="En-tteCar">
-    <w:name w:val="En-tête Car"/>
-    <w:basedOn w:val="Policepardfaut"/>
-    <w:link w:val="En-tte"/>
+  <w:style w:type="character" w:customStyle="1" w:styleId="HeaderChar">
+    <w:name w:val="Header Char"/>
+    <w:basedOn w:val="DefaultParagraphFont"/>
+    <w:link w:val="Header"/>
     <w:uiPriority w:val="99"/>
     <w:rsid w:val="00E871BF"/>
     <w:rPr>
@@ -4830,10 +4639,10 @@
       <w:lang w:eastAsia="ar-SA"/>
     </w:rPr>
   </w:style>
-  <w:style w:type="paragraph" w:styleId="Pieddepage">
+  <w:style w:type="paragraph" w:styleId="Footer">
     <w:name w:val="footer"/>
     <w:basedOn w:val="Normal"/>
-    <w:link w:val="PieddepageCar"/>
+    <w:link w:val="FooterChar"/>
     <w:uiPriority w:val="99"/>
     <w:unhideWhenUsed/>
     <w:rsid w:val="00E871BF"/>
@@ -4844,10 +4653,10 @@
       </w:tabs>
     </w:pPr>
   </w:style>
-  <w:style w:type="character" w:customStyle="1" w:styleId="PieddepageCar">
-    <w:name w:val="Pied de page Car"/>
-    <w:basedOn w:val="Policepardfaut"/>
-    <w:link w:val="Pieddepage"/>
+  <w:style w:type="character" w:customStyle="1" w:styleId="FooterChar">
+    <w:name w:val="Footer Char"/>
+    <w:basedOn w:val="DefaultParagraphFont"/>
+    <w:link w:val="Footer"/>
     <w:uiPriority w:val="99"/>
     <w:rsid w:val="00E871BF"/>
     <w:rPr>
@@ -4857,7 +4666,7 @@
       <w:lang w:eastAsia="ar-SA"/>
     </w:rPr>
   </w:style>
-  <w:style w:type="paragraph" w:styleId="Paragraphedeliste">
+  <w:style w:type="paragraph" w:styleId="ListParagraph">
     <w:name w:val="List Paragraph"/>
     <w:basedOn w:val="Normal"/>
     <w:uiPriority w:val="34"/>
@@ -4875,9 +4684,9 @@
       <w:lang w:eastAsia="en-US"/>
     </w:rPr>
   </w:style>
-  <w:style w:type="table" w:styleId="Grilledutableau">
+  <w:style w:type="table" w:styleId="TableGrid">
     <w:name w:val="Table Grid"/>
-    <w:basedOn w:val="TableauNormal"/>
+    <w:basedOn w:val="TableNormal"/>
     <w:uiPriority w:val="59"/>
     <w:rsid w:val="00130830"/>
     <w:pPr>

</xml_diff>

<commit_message>
Suppression de dossier (fixed !) + template 2 also added !
</commit_message>
<xml_diff>
--- a/src/main/resources/templates/Dossiertemplate.docx
+++ b/src/main/resources/templates/Dossiertemplate.docx
@@ -4,7 +4,7 @@
   <w:body>
     <w:p>
       <w:pPr>
-        <w:pStyle w:val="Titre3"/>
+        <w:pStyle w:val="Heading3"/>
         <w:spacing w:line="240" w:lineRule="auto"/>
         <w:ind w:hanging="11"/>
         <w:jc w:val="left"/>
@@ -16,7 +16,6 @@
           <w:rtl/>
         </w:rPr>
       </w:pPr>
-      <w:proofErr w:type="gramStart"/>
       <w:r>
         <w:rPr>
           <w:rFonts w:cs="Traditional Arabic" w:hint="cs"/>
@@ -25,18 +24,7 @@
           <w:u w:val="none"/>
           <w:rtl/>
         </w:rPr>
-        <w:t>عـــــــــــــــــدد :</w:t>
-      </w:r>
-      <w:proofErr w:type="gramEnd"/>
-      <w:r>
-        <w:rPr>
-          <w:rFonts w:cs="Traditional Arabic" w:hint="cs"/>
-          <w:sz w:val="36"/>
-          <w:szCs w:val="36"/>
-          <w:u w:val="none"/>
-          <w:rtl/>
-        </w:rPr>
-        <w:t xml:space="preserve"> </w:t>
+        <w:t xml:space="preserve">عـــــــــــــــــدد : </w:t>
       </w:r>
       <w:r>
         <w:rPr>
@@ -65,7 +53,7 @@
     </w:p>
     <w:p>
       <w:pPr>
-        <w:pStyle w:val="Titre3"/>
+        <w:pStyle w:val="Heading3"/>
         <w:spacing w:line="240" w:lineRule="auto"/>
         <w:rPr>
           <w:rFonts w:ascii="Traditional Arabic" w:hAnsi="Traditional Arabic" w:cs="Traditional Arabic"/>
@@ -108,7 +96,7 @@
     </w:p>
     <w:p>
       <w:pPr>
-        <w:pStyle w:val="Titre3"/>
+        <w:pStyle w:val="Heading3"/>
         <w:spacing w:line="240" w:lineRule="auto"/>
         <w:ind w:hanging="11"/>
         <w:rPr>
@@ -617,7 +605,7 @@
     </w:p>
     <w:tbl>
       <w:tblPr>
-        <w:tblStyle w:val="Grilledutableau"/>
+        <w:tblStyle w:val="TableGrid"/>
         <w:bidiVisual/>
         <w:tblW w:w="10496" w:type="dxa"/>
         <w:tblInd w:w="-9" w:type="dxa"/>
@@ -638,7 +626,7 @@
       <w:tr>
         <w:tc>
           <w:tcPr>
-            <w:tcW w:w="799" w:type="dxa"/>
+            <w:tcW w:w="660" w:type="dxa"/>
           </w:tcPr>
           <w:p>
             <w:pPr>
@@ -687,7 +675,7 @@
         </w:tc>
         <w:tc>
           <w:tcPr>
-            <w:tcW w:w="1310" w:type="dxa"/>
+            <w:tcW w:w="1094" w:type="dxa"/>
           </w:tcPr>
           <w:p>
             <w:pPr>
@@ -744,7 +732,7 @@
         </w:tc>
         <w:tc>
           <w:tcPr>
-            <w:tcW w:w="569" w:type="dxa"/>
+            <w:tcW w:w="565" w:type="dxa"/>
           </w:tcPr>
           <w:p>
             <w:pPr>
@@ -784,7 +772,7 @@
         </w:tc>
         <w:tc>
           <w:tcPr>
-            <w:tcW w:w="822" w:type="dxa"/>
+            <w:tcW w:w="813" w:type="dxa"/>
           </w:tcPr>
           <w:p>
             <w:pPr>
@@ -844,7 +832,7 @@
         </w:tc>
         <w:tc>
           <w:tcPr>
-            <w:tcW w:w="1288" w:type="dxa"/>
+            <w:tcW w:w="997" w:type="dxa"/>
           </w:tcPr>
           <w:p>
             <w:pPr>
@@ -922,7 +910,7 @@
         </w:tc>
         <w:tc>
           <w:tcPr>
-            <w:tcW w:w="687" w:type="dxa"/>
+            <w:tcW w:w="1488" w:type="dxa"/>
           </w:tcPr>
           <w:p>
             <w:pPr>
@@ -953,7 +941,7 @@
         </w:tc>
         <w:tc>
           <w:tcPr>
-            <w:tcW w:w="948" w:type="dxa"/>
+            <w:tcW w:w="1287" w:type="dxa"/>
           </w:tcPr>
           <w:p>
             <w:pPr>
@@ -984,7 +972,7 @@
         </w:tc>
         <w:tc>
           <w:tcPr>
-            <w:tcW w:w="1060" w:type="dxa"/>
+            <w:tcW w:w="795" w:type="dxa"/>
           </w:tcPr>
           <w:p>
             <w:pPr>
@@ -1015,7 +1003,7 @@
         </w:tc>
         <w:tc>
           <w:tcPr>
-            <w:tcW w:w="1369" w:type="dxa"/>
+            <w:tcW w:w="843" w:type="dxa"/>
           </w:tcPr>
           <w:p>
             <w:pPr>
@@ -1046,7 +1034,7 @@
         </w:tc>
         <w:tc>
           <w:tcPr>
-            <w:tcW w:w="1644" w:type="dxa"/>
+            <w:tcW w:w="1954" w:type="dxa"/>
           </w:tcPr>
           <w:p>
             <w:pPr>
@@ -1110,17 +1098,17 @@
         </w:trPr>
         <w:tc>
           <w:tcPr>
-            <w:tcW w:w="799" w:type="dxa"/>
-          </w:tcPr>
-          <w:p>
-            <w:pPr>
-              <w:jc w:val="center"/>
-            </w:pPr>
-          </w:p>
-        </w:tc>
-        <w:tc>
-          <w:tcPr>
-            <w:tcW w:w="1310" w:type="dxa"/>
+            <w:tcW w:w="660" w:type="dxa"/>
+          </w:tcPr>
+          <w:p>
+            <w:pPr>
+              <w:jc w:val="center"/>
+            </w:pPr>
+          </w:p>
+        </w:tc>
+        <w:tc>
+          <w:tcPr>
+            <w:tcW w:w="1094" w:type="dxa"/>
           </w:tcPr>
           <w:p>
             <w:pPr>
@@ -1146,67 +1134,67 @@
         </w:tc>
         <w:tc>
           <w:tcPr>
-            <w:tcW w:w="569" w:type="dxa"/>
-          </w:tcPr>
-          <w:p>
-            <w:pPr>
-              <w:tabs>
-                <w:tab w:val="center" w:pos="1812"/>
-                <w:tab w:val="left" w:pos="5592"/>
-              </w:tabs>
-              <w:spacing w:line="276" w:lineRule="auto"/>
-              <w:jc w:val="center"/>
-              <w:rPr>
-                <w:rFonts w:ascii="Traditional Arabic" w:hAnsi="Traditional Arabic" w:cs="Traditional Arabic"/>
-                <w:rtl/>
-                <w:lang w:bidi="ar-MA"/>
-              </w:rPr>
-            </w:pPr>
-          </w:p>
-        </w:tc>
-        <w:tc>
-          <w:tcPr>
-            <w:tcW w:w="822" w:type="dxa"/>
-          </w:tcPr>
-          <w:p>
-            <w:pPr>
-              <w:tabs>
-                <w:tab w:val="center" w:pos="1812"/>
-                <w:tab w:val="left" w:pos="5592"/>
-              </w:tabs>
-              <w:spacing w:line="276" w:lineRule="auto"/>
-              <w:jc w:val="center"/>
-              <w:rPr>
-                <w:rFonts w:ascii="Traditional Arabic" w:hAnsi="Traditional Arabic" w:cs="Traditional Arabic"/>
-                <w:rtl/>
-                <w:lang w:bidi="ar-MA"/>
-              </w:rPr>
-            </w:pPr>
-          </w:p>
-        </w:tc>
-        <w:tc>
-          <w:tcPr>
-            <w:tcW w:w="1288" w:type="dxa"/>
-          </w:tcPr>
-          <w:p>
-            <w:pPr>
-              <w:tabs>
-                <w:tab w:val="center" w:pos="1812"/>
-                <w:tab w:val="left" w:pos="5592"/>
-              </w:tabs>
-              <w:spacing w:line="276" w:lineRule="auto"/>
-              <w:jc w:val="center"/>
-              <w:rPr>
-                <w:rFonts w:ascii="Traditional Arabic" w:hAnsi="Traditional Arabic" w:cs="Traditional Arabic"/>
-                <w:rtl/>
-                <w:lang w:bidi="ar-MA"/>
-              </w:rPr>
-            </w:pPr>
-          </w:p>
-        </w:tc>
-        <w:tc>
-          <w:tcPr>
-            <w:tcW w:w="687" w:type="dxa"/>
+            <w:tcW w:w="565" w:type="dxa"/>
+          </w:tcPr>
+          <w:p>
+            <w:pPr>
+              <w:tabs>
+                <w:tab w:val="center" w:pos="1812"/>
+                <w:tab w:val="left" w:pos="5592"/>
+              </w:tabs>
+              <w:spacing w:line="276" w:lineRule="auto"/>
+              <w:jc w:val="center"/>
+              <w:rPr>
+                <w:rFonts w:ascii="Traditional Arabic" w:hAnsi="Traditional Arabic" w:cs="Traditional Arabic"/>
+                <w:rtl/>
+                <w:lang w:bidi="ar-MA"/>
+              </w:rPr>
+            </w:pPr>
+          </w:p>
+        </w:tc>
+        <w:tc>
+          <w:tcPr>
+            <w:tcW w:w="813" w:type="dxa"/>
+          </w:tcPr>
+          <w:p>
+            <w:pPr>
+              <w:tabs>
+                <w:tab w:val="center" w:pos="1812"/>
+                <w:tab w:val="left" w:pos="5592"/>
+              </w:tabs>
+              <w:spacing w:line="276" w:lineRule="auto"/>
+              <w:jc w:val="center"/>
+              <w:rPr>
+                <w:rFonts w:ascii="Traditional Arabic" w:hAnsi="Traditional Arabic" w:cs="Traditional Arabic"/>
+                <w:rtl/>
+                <w:lang w:bidi="ar-MA"/>
+              </w:rPr>
+            </w:pPr>
+          </w:p>
+        </w:tc>
+        <w:tc>
+          <w:tcPr>
+            <w:tcW w:w="997" w:type="dxa"/>
+          </w:tcPr>
+          <w:p>
+            <w:pPr>
+              <w:tabs>
+                <w:tab w:val="center" w:pos="1812"/>
+                <w:tab w:val="left" w:pos="5592"/>
+              </w:tabs>
+              <w:spacing w:line="276" w:lineRule="auto"/>
+              <w:jc w:val="center"/>
+              <w:rPr>
+                <w:rFonts w:ascii="Traditional Arabic" w:hAnsi="Traditional Arabic" w:cs="Traditional Arabic"/>
+                <w:rtl/>
+                <w:lang w:bidi="ar-MA"/>
+              </w:rPr>
+            </w:pPr>
+          </w:p>
+        </w:tc>
+        <w:tc>
+          <w:tcPr>
+            <w:tcW w:w="1488" w:type="dxa"/>
           </w:tcPr>
           <w:p>
             <w:pPr>
@@ -1239,7 +1227,7 @@
         </w:tc>
         <w:tc>
           <w:tcPr>
-            <w:tcW w:w="948" w:type="dxa"/>
+            <w:tcW w:w="1287" w:type="dxa"/>
           </w:tcPr>
           <w:p>
             <w:pPr>
@@ -1259,46 +1247,46 @@
         </w:tc>
         <w:tc>
           <w:tcPr>
-            <w:tcW w:w="1060" w:type="dxa"/>
-          </w:tcPr>
-          <w:p>
-            <w:pPr>
-              <w:tabs>
-                <w:tab w:val="center" w:pos="1812"/>
-                <w:tab w:val="left" w:pos="5592"/>
-              </w:tabs>
-              <w:spacing w:line="276" w:lineRule="auto"/>
-              <w:rPr>
-                <w:rFonts w:ascii="Traditional Arabic" w:hAnsi="Traditional Arabic" w:cs="Traditional Arabic"/>
-                <w:rtl/>
-                <w:lang w:bidi="ar-MA"/>
-              </w:rPr>
-            </w:pPr>
-          </w:p>
-        </w:tc>
-        <w:tc>
-          <w:tcPr>
-            <w:tcW w:w="1369" w:type="dxa"/>
-          </w:tcPr>
-          <w:p>
-            <w:pPr>
-              <w:tabs>
-                <w:tab w:val="center" w:pos="1812"/>
-                <w:tab w:val="left" w:pos="5592"/>
-              </w:tabs>
-              <w:spacing w:line="276" w:lineRule="auto"/>
-              <w:jc w:val="center"/>
-              <w:rPr>
-                <w:rFonts w:ascii="Traditional Arabic" w:hAnsi="Traditional Arabic" w:cs="Traditional Arabic"/>
-                <w:rtl/>
-                <w:lang w:bidi="ar-MA"/>
-              </w:rPr>
-            </w:pPr>
-          </w:p>
-        </w:tc>
-        <w:tc>
-          <w:tcPr>
-            <w:tcW w:w="1644" w:type="dxa"/>
+            <w:tcW w:w="795" w:type="dxa"/>
+          </w:tcPr>
+          <w:p>
+            <w:pPr>
+              <w:tabs>
+                <w:tab w:val="center" w:pos="1812"/>
+                <w:tab w:val="left" w:pos="5592"/>
+              </w:tabs>
+              <w:spacing w:line="276" w:lineRule="auto"/>
+              <w:rPr>
+                <w:rFonts w:ascii="Traditional Arabic" w:hAnsi="Traditional Arabic" w:cs="Traditional Arabic"/>
+                <w:rtl/>
+                <w:lang w:bidi="ar-MA"/>
+              </w:rPr>
+            </w:pPr>
+          </w:p>
+        </w:tc>
+        <w:tc>
+          <w:tcPr>
+            <w:tcW w:w="843" w:type="dxa"/>
+          </w:tcPr>
+          <w:p>
+            <w:pPr>
+              <w:tabs>
+                <w:tab w:val="center" w:pos="1812"/>
+                <w:tab w:val="left" w:pos="5592"/>
+              </w:tabs>
+              <w:spacing w:line="276" w:lineRule="auto"/>
+              <w:jc w:val="center"/>
+              <w:rPr>
+                <w:rFonts w:ascii="Traditional Arabic" w:hAnsi="Traditional Arabic" w:cs="Traditional Arabic"/>
+                <w:rtl/>
+                <w:lang w:bidi="ar-MA"/>
+              </w:rPr>
+            </w:pPr>
+          </w:p>
+        </w:tc>
+        <w:tc>
+          <w:tcPr>
+            <w:tcW w:w="1954" w:type="dxa"/>
           </w:tcPr>
           <w:p>
             <w:pPr>
@@ -1346,153 +1334,153 @@
         </w:trPr>
         <w:tc>
           <w:tcPr>
-            <w:tcW w:w="799" w:type="dxa"/>
+            <w:tcW w:w="660" w:type="dxa"/>
           </w:tcPr>
           <w:p/>
         </w:tc>
         <w:tc>
           <w:tcPr>
-            <w:tcW w:w="1310" w:type="dxa"/>
-          </w:tcPr>
-          <w:p>
-            <w:pPr>
-              <w:tabs>
-                <w:tab w:val="center" w:pos="1812"/>
-                <w:tab w:val="left" w:pos="5592"/>
-              </w:tabs>
-              <w:spacing w:line="276" w:lineRule="auto"/>
-              <w:rPr>
-                <w:rFonts w:ascii="Traditional Arabic" w:hAnsi="Traditional Arabic" w:cs="Traditional Arabic"/>
-                <w:rtl/>
-                <w:lang w:bidi="ar-MA"/>
-              </w:rPr>
-            </w:pPr>
-          </w:p>
-        </w:tc>
-        <w:tc>
-          <w:tcPr>
-            <w:tcW w:w="569" w:type="dxa"/>
-          </w:tcPr>
-          <w:p>
-            <w:pPr>
-              <w:tabs>
-                <w:tab w:val="center" w:pos="1812"/>
-                <w:tab w:val="left" w:pos="5592"/>
-              </w:tabs>
-              <w:spacing w:line="276" w:lineRule="auto"/>
-              <w:jc w:val="center"/>
-              <w:rPr>
-                <w:rFonts w:ascii="Traditional Arabic" w:hAnsi="Traditional Arabic" w:cs="Traditional Arabic"/>
-                <w:rtl/>
-                <w:lang w:bidi="ar-MA"/>
-              </w:rPr>
-            </w:pPr>
-          </w:p>
-        </w:tc>
-        <w:tc>
-          <w:tcPr>
-            <w:tcW w:w="822" w:type="dxa"/>
-          </w:tcPr>
-          <w:p>
-            <w:pPr>
-              <w:tabs>
-                <w:tab w:val="center" w:pos="1812"/>
-                <w:tab w:val="left" w:pos="5592"/>
-              </w:tabs>
-              <w:spacing w:line="276" w:lineRule="auto"/>
-              <w:jc w:val="center"/>
-              <w:rPr>
-                <w:rFonts w:ascii="Traditional Arabic" w:hAnsi="Traditional Arabic" w:cs="Traditional Arabic"/>
-                <w:rtl/>
-                <w:lang w:bidi="ar-MA"/>
-              </w:rPr>
-            </w:pPr>
-          </w:p>
-        </w:tc>
-        <w:tc>
-          <w:tcPr>
-            <w:tcW w:w="1288" w:type="dxa"/>
-          </w:tcPr>
-          <w:p>
-            <w:pPr>
-              <w:tabs>
-                <w:tab w:val="center" w:pos="1812"/>
-                <w:tab w:val="left" w:pos="5592"/>
-              </w:tabs>
-              <w:spacing w:line="276" w:lineRule="auto"/>
-              <w:rPr>
-                <w:rFonts w:ascii="Traditional Arabic" w:hAnsi="Traditional Arabic" w:cs="Traditional Arabic"/>
-                <w:rtl/>
-                <w:lang w:bidi="ar-MA"/>
-              </w:rPr>
-            </w:pPr>
-          </w:p>
-        </w:tc>
-        <w:tc>
-          <w:tcPr>
-            <w:tcW w:w="687" w:type="dxa"/>
-          </w:tcPr>
-          <w:p>
-            <w:pPr>
-              <w:jc w:val="center"/>
-            </w:pPr>
-          </w:p>
-        </w:tc>
-        <w:tc>
-          <w:tcPr>
-            <w:tcW w:w="948" w:type="dxa"/>
-          </w:tcPr>
-          <w:p>
-            <w:pPr>
-              <w:jc w:val="center"/>
-              <w:rPr>
-                <w:rtl/>
-              </w:rPr>
-            </w:pPr>
-          </w:p>
-        </w:tc>
-        <w:tc>
-          <w:tcPr>
-            <w:tcW w:w="1060" w:type="dxa"/>
-          </w:tcPr>
-          <w:p>
-            <w:pPr>
-              <w:tabs>
-                <w:tab w:val="center" w:pos="1812"/>
-                <w:tab w:val="left" w:pos="5592"/>
-              </w:tabs>
-              <w:spacing w:line="276" w:lineRule="auto"/>
-              <w:jc w:val="center"/>
-              <w:rPr>
-                <w:rFonts w:ascii="Traditional Arabic" w:hAnsi="Traditional Arabic" w:cs="Traditional Arabic"/>
-                <w:rtl/>
-                <w:lang w:bidi="ar-MA"/>
-              </w:rPr>
-            </w:pPr>
-          </w:p>
-        </w:tc>
-        <w:tc>
-          <w:tcPr>
-            <w:tcW w:w="1369" w:type="dxa"/>
-          </w:tcPr>
-          <w:p>
-            <w:pPr>
-              <w:tabs>
-                <w:tab w:val="center" w:pos="1812"/>
-                <w:tab w:val="left" w:pos="5592"/>
-              </w:tabs>
-              <w:spacing w:line="276" w:lineRule="auto"/>
-              <w:rPr>
-                <w:rFonts w:ascii="Traditional Arabic" w:hAnsi="Traditional Arabic" w:cs="Traditional Arabic"/>
-                <w:rtl/>
-                <w:lang w:bidi="ar-MA"/>
-              </w:rPr>
-            </w:pPr>
-          </w:p>
-        </w:tc>
-        <w:tc>
-          <w:tcPr>
-            <w:tcW w:w="1644" w:type="dxa"/>
+            <w:tcW w:w="1094" w:type="dxa"/>
+          </w:tcPr>
+          <w:p>
+            <w:pPr>
+              <w:tabs>
+                <w:tab w:val="center" w:pos="1812"/>
+                <w:tab w:val="left" w:pos="5592"/>
+              </w:tabs>
+              <w:spacing w:line="276" w:lineRule="auto"/>
+              <w:rPr>
+                <w:rFonts w:ascii="Traditional Arabic" w:hAnsi="Traditional Arabic" w:cs="Traditional Arabic"/>
+                <w:rtl/>
+                <w:lang w:bidi="ar-MA"/>
+              </w:rPr>
+            </w:pPr>
+          </w:p>
+        </w:tc>
+        <w:tc>
+          <w:tcPr>
+            <w:tcW w:w="565" w:type="dxa"/>
+          </w:tcPr>
+          <w:p>
+            <w:pPr>
+              <w:tabs>
+                <w:tab w:val="center" w:pos="1812"/>
+                <w:tab w:val="left" w:pos="5592"/>
+              </w:tabs>
+              <w:spacing w:line="276" w:lineRule="auto"/>
+              <w:jc w:val="center"/>
+              <w:rPr>
+                <w:rFonts w:ascii="Traditional Arabic" w:hAnsi="Traditional Arabic" w:cs="Traditional Arabic"/>
+                <w:rtl/>
+                <w:lang w:bidi="ar-MA"/>
+              </w:rPr>
+            </w:pPr>
+          </w:p>
+        </w:tc>
+        <w:tc>
+          <w:tcPr>
+            <w:tcW w:w="813" w:type="dxa"/>
+          </w:tcPr>
+          <w:p>
+            <w:pPr>
+              <w:tabs>
+                <w:tab w:val="center" w:pos="1812"/>
+                <w:tab w:val="left" w:pos="5592"/>
+              </w:tabs>
+              <w:spacing w:line="276" w:lineRule="auto"/>
+              <w:jc w:val="center"/>
+              <w:rPr>
+                <w:rFonts w:ascii="Traditional Arabic" w:hAnsi="Traditional Arabic" w:cs="Traditional Arabic"/>
+                <w:rtl/>
+                <w:lang w:bidi="ar-MA"/>
+              </w:rPr>
+            </w:pPr>
+          </w:p>
+        </w:tc>
+        <w:tc>
+          <w:tcPr>
+            <w:tcW w:w="997" w:type="dxa"/>
+          </w:tcPr>
+          <w:p>
+            <w:pPr>
+              <w:tabs>
+                <w:tab w:val="center" w:pos="1812"/>
+                <w:tab w:val="left" w:pos="5592"/>
+              </w:tabs>
+              <w:spacing w:line="276" w:lineRule="auto"/>
+              <w:rPr>
+                <w:rFonts w:ascii="Traditional Arabic" w:hAnsi="Traditional Arabic" w:cs="Traditional Arabic"/>
+                <w:rtl/>
+                <w:lang w:bidi="ar-MA"/>
+              </w:rPr>
+            </w:pPr>
+          </w:p>
+        </w:tc>
+        <w:tc>
+          <w:tcPr>
+            <w:tcW w:w="1488" w:type="dxa"/>
+          </w:tcPr>
+          <w:p>
+            <w:pPr>
+              <w:jc w:val="center"/>
+            </w:pPr>
+          </w:p>
+        </w:tc>
+        <w:tc>
+          <w:tcPr>
+            <w:tcW w:w="1287" w:type="dxa"/>
+          </w:tcPr>
+          <w:p>
+            <w:pPr>
+              <w:jc w:val="center"/>
+              <w:rPr>
+                <w:rtl/>
+              </w:rPr>
+            </w:pPr>
+          </w:p>
+        </w:tc>
+        <w:tc>
+          <w:tcPr>
+            <w:tcW w:w="795" w:type="dxa"/>
+          </w:tcPr>
+          <w:p>
+            <w:pPr>
+              <w:tabs>
+                <w:tab w:val="center" w:pos="1812"/>
+                <w:tab w:val="left" w:pos="5592"/>
+              </w:tabs>
+              <w:spacing w:line="276" w:lineRule="auto"/>
+              <w:jc w:val="center"/>
+              <w:rPr>
+                <w:rFonts w:ascii="Traditional Arabic" w:hAnsi="Traditional Arabic" w:cs="Traditional Arabic"/>
+                <w:rtl/>
+                <w:lang w:bidi="ar-MA"/>
+              </w:rPr>
+            </w:pPr>
+          </w:p>
+        </w:tc>
+        <w:tc>
+          <w:tcPr>
+            <w:tcW w:w="843" w:type="dxa"/>
+          </w:tcPr>
+          <w:p>
+            <w:pPr>
+              <w:tabs>
+                <w:tab w:val="center" w:pos="1812"/>
+                <w:tab w:val="left" w:pos="5592"/>
+              </w:tabs>
+              <w:spacing w:line="276" w:lineRule="auto"/>
+              <w:rPr>
+                <w:rFonts w:ascii="Traditional Arabic" w:hAnsi="Traditional Arabic" w:cs="Traditional Arabic"/>
+                <w:rtl/>
+                <w:lang w:bidi="ar-MA"/>
+              </w:rPr>
+            </w:pPr>
+          </w:p>
+        </w:tc>
+        <w:tc>
+          <w:tcPr>
+            <w:tcW w:w="1954" w:type="dxa"/>
           </w:tcPr>
           <w:p>
             <w:pPr>
@@ -1517,155 +1505,155 @@
         </w:trPr>
         <w:tc>
           <w:tcPr>
-            <w:tcW w:w="799" w:type="dxa"/>
+            <w:tcW w:w="660" w:type="dxa"/>
           </w:tcPr>
           <w:p/>
         </w:tc>
         <w:tc>
           <w:tcPr>
-            <w:tcW w:w="1310" w:type="dxa"/>
-          </w:tcPr>
-          <w:p>
-            <w:pPr>
-              <w:tabs>
-                <w:tab w:val="center" w:pos="1812"/>
-                <w:tab w:val="left" w:pos="5592"/>
-              </w:tabs>
-              <w:spacing w:line="276" w:lineRule="auto"/>
-              <w:jc w:val="center"/>
-              <w:rPr>
-                <w:rFonts w:ascii="Traditional Arabic" w:hAnsi="Traditional Arabic" w:cs="Traditional Arabic"/>
-                <w:rtl/>
-                <w:lang w:bidi="ar-MA"/>
-              </w:rPr>
-            </w:pPr>
-          </w:p>
-        </w:tc>
-        <w:tc>
-          <w:tcPr>
-            <w:tcW w:w="569" w:type="dxa"/>
-          </w:tcPr>
-          <w:p>
-            <w:pPr>
-              <w:tabs>
-                <w:tab w:val="center" w:pos="1812"/>
-                <w:tab w:val="left" w:pos="5592"/>
-              </w:tabs>
-              <w:spacing w:line="276" w:lineRule="auto"/>
-              <w:jc w:val="center"/>
-              <w:rPr>
-                <w:rFonts w:ascii="Traditional Arabic" w:hAnsi="Traditional Arabic" w:cs="Traditional Arabic"/>
-                <w:rtl/>
-                <w:lang w:bidi="ar-MA"/>
-              </w:rPr>
-            </w:pPr>
-          </w:p>
-        </w:tc>
-        <w:tc>
-          <w:tcPr>
-            <w:tcW w:w="822" w:type="dxa"/>
-          </w:tcPr>
-          <w:p>
-            <w:pPr>
-              <w:tabs>
-                <w:tab w:val="center" w:pos="1812"/>
-                <w:tab w:val="left" w:pos="5592"/>
-              </w:tabs>
-              <w:spacing w:line="276" w:lineRule="auto"/>
-              <w:jc w:val="center"/>
-              <w:rPr>
-                <w:rFonts w:ascii="Traditional Arabic" w:hAnsi="Traditional Arabic" w:cs="Traditional Arabic"/>
-                <w:rtl/>
-                <w:lang w:bidi="ar-MA"/>
-              </w:rPr>
-            </w:pPr>
-          </w:p>
-        </w:tc>
-        <w:tc>
-          <w:tcPr>
-            <w:tcW w:w="1288" w:type="dxa"/>
-          </w:tcPr>
-          <w:p>
-            <w:pPr>
-              <w:tabs>
-                <w:tab w:val="center" w:pos="1812"/>
-                <w:tab w:val="left" w:pos="5592"/>
-              </w:tabs>
-              <w:spacing w:line="276" w:lineRule="auto"/>
-              <w:rPr>
-                <w:rFonts w:ascii="Traditional Arabic" w:hAnsi="Traditional Arabic" w:cs="Traditional Arabic"/>
-                <w:rtl/>
-                <w:lang w:bidi="ar-MA"/>
-              </w:rPr>
-            </w:pPr>
-          </w:p>
-        </w:tc>
-        <w:tc>
-          <w:tcPr>
-            <w:tcW w:w="687" w:type="dxa"/>
-          </w:tcPr>
-          <w:p>
-            <w:pPr>
-              <w:jc w:val="center"/>
-            </w:pPr>
-          </w:p>
-        </w:tc>
-        <w:tc>
-          <w:tcPr>
-            <w:tcW w:w="948" w:type="dxa"/>
-          </w:tcPr>
-          <w:p>
-            <w:pPr>
-              <w:jc w:val="center"/>
-              <w:rPr>
-                <w:rtl/>
-              </w:rPr>
-            </w:pPr>
-          </w:p>
-        </w:tc>
-        <w:tc>
-          <w:tcPr>
-            <w:tcW w:w="1060" w:type="dxa"/>
-          </w:tcPr>
-          <w:p>
-            <w:pPr>
-              <w:tabs>
-                <w:tab w:val="center" w:pos="1812"/>
-                <w:tab w:val="left" w:pos="5592"/>
-              </w:tabs>
-              <w:spacing w:line="276" w:lineRule="auto"/>
-              <w:jc w:val="center"/>
-              <w:rPr>
-                <w:rFonts w:ascii="Traditional Arabic" w:hAnsi="Traditional Arabic" w:cs="Traditional Arabic"/>
-                <w:rtl/>
-                <w:lang w:bidi="ar-MA"/>
-              </w:rPr>
-            </w:pPr>
-          </w:p>
-        </w:tc>
-        <w:tc>
-          <w:tcPr>
-            <w:tcW w:w="1369" w:type="dxa"/>
-          </w:tcPr>
-          <w:p>
-            <w:pPr>
-              <w:tabs>
-                <w:tab w:val="center" w:pos="1812"/>
-                <w:tab w:val="left" w:pos="5592"/>
-              </w:tabs>
-              <w:spacing w:line="276" w:lineRule="auto"/>
-              <w:jc w:val="center"/>
-              <w:rPr>
-                <w:rFonts w:ascii="Traditional Arabic" w:hAnsi="Traditional Arabic" w:cs="Traditional Arabic"/>
-                <w:rtl/>
-                <w:lang w:bidi="ar-MA"/>
-              </w:rPr>
-            </w:pPr>
-          </w:p>
-        </w:tc>
-        <w:tc>
-          <w:tcPr>
-            <w:tcW w:w="1644" w:type="dxa"/>
+            <w:tcW w:w="1094" w:type="dxa"/>
+          </w:tcPr>
+          <w:p>
+            <w:pPr>
+              <w:tabs>
+                <w:tab w:val="center" w:pos="1812"/>
+                <w:tab w:val="left" w:pos="5592"/>
+              </w:tabs>
+              <w:spacing w:line="276" w:lineRule="auto"/>
+              <w:jc w:val="center"/>
+              <w:rPr>
+                <w:rFonts w:ascii="Traditional Arabic" w:hAnsi="Traditional Arabic" w:cs="Traditional Arabic"/>
+                <w:rtl/>
+                <w:lang w:bidi="ar-MA"/>
+              </w:rPr>
+            </w:pPr>
+          </w:p>
+        </w:tc>
+        <w:tc>
+          <w:tcPr>
+            <w:tcW w:w="565" w:type="dxa"/>
+          </w:tcPr>
+          <w:p>
+            <w:pPr>
+              <w:tabs>
+                <w:tab w:val="center" w:pos="1812"/>
+                <w:tab w:val="left" w:pos="5592"/>
+              </w:tabs>
+              <w:spacing w:line="276" w:lineRule="auto"/>
+              <w:jc w:val="center"/>
+              <w:rPr>
+                <w:rFonts w:ascii="Traditional Arabic" w:hAnsi="Traditional Arabic" w:cs="Traditional Arabic"/>
+                <w:rtl/>
+                <w:lang w:bidi="ar-MA"/>
+              </w:rPr>
+            </w:pPr>
+          </w:p>
+        </w:tc>
+        <w:tc>
+          <w:tcPr>
+            <w:tcW w:w="813" w:type="dxa"/>
+          </w:tcPr>
+          <w:p>
+            <w:pPr>
+              <w:tabs>
+                <w:tab w:val="center" w:pos="1812"/>
+                <w:tab w:val="left" w:pos="5592"/>
+              </w:tabs>
+              <w:spacing w:line="276" w:lineRule="auto"/>
+              <w:jc w:val="center"/>
+              <w:rPr>
+                <w:rFonts w:ascii="Traditional Arabic" w:hAnsi="Traditional Arabic" w:cs="Traditional Arabic"/>
+                <w:rtl/>
+                <w:lang w:bidi="ar-MA"/>
+              </w:rPr>
+            </w:pPr>
+          </w:p>
+        </w:tc>
+        <w:tc>
+          <w:tcPr>
+            <w:tcW w:w="997" w:type="dxa"/>
+          </w:tcPr>
+          <w:p>
+            <w:pPr>
+              <w:tabs>
+                <w:tab w:val="center" w:pos="1812"/>
+                <w:tab w:val="left" w:pos="5592"/>
+              </w:tabs>
+              <w:spacing w:line="276" w:lineRule="auto"/>
+              <w:rPr>
+                <w:rFonts w:ascii="Traditional Arabic" w:hAnsi="Traditional Arabic" w:cs="Traditional Arabic"/>
+                <w:rtl/>
+                <w:lang w:bidi="ar-MA"/>
+              </w:rPr>
+            </w:pPr>
+          </w:p>
+        </w:tc>
+        <w:tc>
+          <w:tcPr>
+            <w:tcW w:w="1488" w:type="dxa"/>
+          </w:tcPr>
+          <w:p>
+            <w:pPr>
+              <w:jc w:val="center"/>
+            </w:pPr>
+          </w:p>
+        </w:tc>
+        <w:tc>
+          <w:tcPr>
+            <w:tcW w:w="1287" w:type="dxa"/>
+          </w:tcPr>
+          <w:p>
+            <w:pPr>
+              <w:jc w:val="center"/>
+              <w:rPr>
+                <w:rtl/>
+              </w:rPr>
+            </w:pPr>
+          </w:p>
+        </w:tc>
+        <w:tc>
+          <w:tcPr>
+            <w:tcW w:w="795" w:type="dxa"/>
+          </w:tcPr>
+          <w:p>
+            <w:pPr>
+              <w:tabs>
+                <w:tab w:val="center" w:pos="1812"/>
+                <w:tab w:val="left" w:pos="5592"/>
+              </w:tabs>
+              <w:spacing w:line="276" w:lineRule="auto"/>
+              <w:jc w:val="center"/>
+              <w:rPr>
+                <w:rFonts w:ascii="Traditional Arabic" w:hAnsi="Traditional Arabic" w:cs="Traditional Arabic"/>
+                <w:rtl/>
+                <w:lang w:bidi="ar-MA"/>
+              </w:rPr>
+            </w:pPr>
+          </w:p>
+        </w:tc>
+        <w:tc>
+          <w:tcPr>
+            <w:tcW w:w="843" w:type="dxa"/>
+          </w:tcPr>
+          <w:p>
+            <w:pPr>
+              <w:tabs>
+                <w:tab w:val="center" w:pos="1812"/>
+                <w:tab w:val="left" w:pos="5592"/>
+              </w:tabs>
+              <w:spacing w:line="276" w:lineRule="auto"/>
+              <w:jc w:val="center"/>
+              <w:rPr>
+                <w:rFonts w:ascii="Traditional Arabic" w:hAnsi="Traditional Arabic" w:cs="Traditional Arabic"/>
+                <w:rtl/>
+                <w:lang w:bidi="ar-MA"/>
+              </w:rPr>
+            </w:pPr>
+          </w:p>
+        </w:tc>
+        <w:tc>
+          <w:tcPr>
+            <w:tcW w:w="1954" w:type="dxa"/>
           </w:tcPr>
           <w:p>
             <w:pPr>
@@ -1690,121 +1678,121 @@
         </w:trPr>
         <w:tc>
           <w:tcPr>
-            <w:tcW w:w="799" w:type="dxa"/>
-          </w:tcPr>
-          <w:p>
-            <w:pPr>
-              <w:jc w:val="center"/>
-              <w:rPr>
-                <w:rtl/>
-              </w:rPr>
-            </w:pPr>
-          </w:p>
-        </w:tc>
-        <w:tc>
-          <w:tcPr>
-            <w:tcW w:w="1310" w:type="dxa"/>
-          </w:tcPr>
-          <w:p>
-            <w:pPr>
-              <w:tabs>
-                <w:tab w:val="center" w:pos="1812"/>
-                <w:tab w:val="left" w:pos="5592"/>
-              </w:tabs>
-              <w:spacing w:line="276" w:lineRule="auto"/>
-              <w:rPr>
-                <w:rFonts w:ascii="Traditional Arabic" w:hAnsi="Traditional Arabic" w:cs="Traditional Arabic"/>
-                <w:rtl/>
-                <w:lang w:bidi="ar-MA"/>
-              </w:rPr>
-            </w:pPr>
-          </w:p>
-        </w:tc>
-        <w:tc>
-          <w:tcPr>
-            <w:tcW w:w="569" w:type="dxa"/>
-          </w:tcPr>
-          <w:p>
-            <w:pPr>
-              <w:tabs>
-                <w:tab w:val="center" w:pos="1812"/>
-                <w:tab w:val="left" w:pos="5592"/>
-              </w:tabs>
-              <w:spacing w:line="276" w:lineRule="auto"/>
-              <w:jc w:val="center"/>
-              <w:rPr>
-                <w:rFonts w:ascii="Traditional Arabic" w:hAnsi="Traditional Arabic" w:cs="Traditional Arabic"/>
-                <w:rtl/>
-                <w:lang w:bidi="ar-MA"/>
-              </w:rPr>
-            </w:pPr>
-          </w:p>
-        </w:tc>
-        <w:tc>
-          <w:tcPr>
-            <w:tcW w:w="822" w:type="dxa"/>
-          </w:tcPr>
-          <w:p>
-            <w:pPr>
-              <w:tabs>
-                <w:tab w:val="center" w:pos="1812"/>
-                <w:tab w:val="left" w:pos="5592"/>
-              </w:tabs>
-              <w:spacing w:line="276" w:lineRule="auto"/>
-              <w:jc w:val="center"/>
-              <w:rPr>
-                <w:rFonts w:ascii="Traditional Arabic" w:hAnsi="Traditional Arabic" w:cs="Traditional Arabic"/>
-                <w:rtl/>
-                <w:lang w:bidi="ar-MA"/>
-              </w:rPr>
-            </w:pPr>
-          </w:p>
-        </w:tc>
-        <w:tc>
-          <w:tcPr>
-            <w:tcW w:w="1288" w:type="dxa"/>
-          </w:tcPr>
-          <w:p>
-            <w:pPr>
-              <w:tabs>
-                <w:tab w:val="center" w:pos="1812"/>
-                <w:tab w:val="left" w:pos="5592"/>
-              </w:tabs>
-              <w:spacing w:line="276" w:lineRule="auto"/>
-              <w:rPr>
-                <w:rFonts w:ascii="Traditional Arabic" w:hAnsi="Traditional Arabic" w:cs="Traditional Arabic"/>
-                <w:rtl/>
-                <w:lang w:bidi="ar-MA"/>
-              </w:rPr>
-            </w:pPr>
-          </w:p>
-        </w:tc>
-        <w:tc>
-          <w:tcPr>
-            <w:tcW w:w="687" w:type="dxa"/>
-          </w:tcPr>
-          <w:p>
-            <w:pPr>
-              <w:jc w:val="center"/>
-            </w:pPr>
-          </w:p>
-        </w:tc>
-        <w:tc>
-          <w:tcPr>
-            <w:tcW w:w="948" w:type="dxa"/>
-          </w:tcPr>
-          <w:p>
-            <w:pPr>
-              <w:jc w:val="center"/>
-              <w:rPr>
-                <w:rtl/>
-              </w:rPr>
-            </w:pPr>
-          </w:p>
-        </w:tc>
-        <w:tc>
-          <w:tcPr>
-            <w:tcW w:w="1060" w:type="dxa"/>
+            <w:tcW w:w="660" w:type="dxa"/>
+          </w:tcPr>
+          <w:p>
+            <w:pPr>
+              <w:jc w:val="center"/>
+              <w:rPr>
+                <w:rtl/>
+              </w:rPr>
+            </w:pPr>
+          </w:p>
+        </w:tc>
+        <w:tc>
+          <w:tcPr>
+            <w:tcW w:w="1094" w:type="dxa"/>
+          </w:tcPr>
+          <w:p>
+            <w:pPr>
+              <w:tabs>
+                <w:tab w:val="center" w:pos="1812"/>
+                <w:tab w:val="left" w:pos="5592"/>
+              </w:tabs>
+              <w:spacing w:line="276" w:lineRule="auto"/>
+              <w:rPr>
+                <w:rFonts w:ascii="Traditional Arabic" w:hAnsi="Traditional Arabic" w:cs="Traditional Arabic"/>
+                <w:rtl/>
+                <w:lang w:bidi="ar-MA"/>
+              </w:rPr>
+            </w:pPr>
+          </w:p>
+        </w:tc>
+        <w:tc>
+          <w:tcPr>
+            <w:tcW w:w="565" w:type="dxa"/>
+          </w:tcPr>
+          <w:p>
+            <w:pPr>
+              <w:tabs>
+                <w:tab w:val="center" w:pos="1812"/>
+                <w:tab w:val="left" w:pos="5592"/>
+              </w:tabs>
+              <w:spacing w:line="276" w:lineRule="auto"/>
+              <w:jc w:val="center"/>
+              <w:rPr>
+                <w:rFonts w:ascii="Traditional Arabic" w:hAnsi="Traditional Arabic" w:cs="Traditional Arabic"/>
+                <w:rtl/>
+                <w:lang w:bidi="ar-MA"/>
+              </w:rPr>
+            </w:pPr>
+          </w:p>
+        </w:tc>
+        <w:tc>
+          <w:tcPr>
+            <w:tcW w:w="813" w:type="dxa"/>
+          </w:tcPr>
+          <w:p>
+            <w:pPr>
+              <w:tabs>
+                <w:tab w:val="center" w:pos="1812"/>
+                <w:tab w:val="left" w:pos="5592"/>
+              </w:tabs>
+              <w:spacing w:line="276" w:lineRule="auto"/>
+              <w:jc w:val="center"/>
+              <w:rPr>
+                <w:rFonts w:ascii="Traditional Arabic" w:hAnsi="Traditional Arabic" w:cs="Traditional Arabic"/>
+                <w:rtl/>
+                <w:lang w:bidi="ar-MA"/>
+              </w:rPr>
+            </w:pPr>
+          </w:p>
+        </w:tc>
+        <w:tc>
+          <w:tcPr>
+            <w:tcW w:w="997" w:type="dxa"/>
+          </w:tcPr>
+          <w:p>
+            <w:pPr>
+              <w:tabs>
+                <w:tab w:val="center" w:pos="1812"/>
+                <w:tab w:val="left" w:pos="5592"/>
+              </w:tabs>
+              <w:spacing w:line="276" w:lineRule="auto"/>
+              <w:rPr>
+                <w:rFonts w:ascii="Traditional Arabic" w:hAnsi="Traditional Arabic" w:cs="Traditional Arabic"/>
+                <w:rtl/>
+                <w:lang w:bidi="ar-MA"/>
+              </w:rPr>
+            </w:pPr>
+          </w:p>
+        </w:tc>
+        <w:tc>
+          <w:tcPr>
+            <w:tcW w:w="1488" w:type="dxa"/>
+          </w:tcPr>
+          <w:p>
+            <w:pPr>
+              <w:jc w:val="center"/>
+            </w:pPr>
+          </w:p>
+        </w:tc>
+        <w:tc>
+          <w:tcPr>
+            <w:tcW w:w="1287" w:type="dxa"/>
+          </w:tcPr>
+          <w:p>
+            <w:pPr>
+              <w:jc w:val="center"/>
+              <w:rPr>
+                <w:rtl/>
+              </w:rPr>
+            </w:pPr>
+          </w:p>
+        </w:tc>
+        <w:tc>
+          <w:tcPr>
+            <w:tcW w:w="795" w:type="dxa"/>
           </w:tcPr>
           <w:p>
             <w:pPr>
@@ -1831,27 +1819,27 @@
         </w:tc>
         <w:tc>
           <w:tcPr>
-            <w:tcW w:w="1369" w:type="dxa"/>
-          </w:tcPr>
-          <w:p>
-            <w:pPr>
-              <w:tabs>
-                <w:tab w:val="center" w:pos="1812"/>
-                <w:tab w:val="left" w:pos="5592"/>
-              </w:tabs>
-              <w:spacing w:line="276" w:lineRule="auto"/>
-              <w:jc w:val="center"/>
-              <w:rPr>
-                <w:rFonts w:ascii="Traditional Arabic" w:hAnsi="Traditional Arabic" w:cs="Traditional Arabic"/>
-                <w:rtl/>
-                <w:lang w:bidi="ar-MA"/>
-              </w:rPr>
-            </w:pPr>
-          </w:p>
-        </w:tc>
-        <w:tc>
-          <w:tcPr>
-            <w:tcW w:w="1644" w:type="dxa"/>
+            <w:tcW w:w="843" w:type="dxa"/>
+          </w:tcPr>
+          <w:p>
+            <w:pPr>
+              <w:tabs>
+                <w:tab w:val="center" w:pos="1812"/>
+                <w:tab w:val="left" w:pos="5592"/>
+              </w:tabs>
+              <w:spacing w:line="276" w:lineRule="auto"/>
+              <w:jc w:val="center"/>
+              <w:rPr>
+                <w:rFonts w:ascii="Traditional Arabic" w:hAnsi="Traditional Arabic" w:cs="Traditional Arabic"/>
+                <w:rtl/>
+                <w:lang w:bidi="ar-MA"/>
+              </w:rPr>
+            </w:pPr>
+          </w:p>
+        </w:tc>
+        <w:tc>
+          <w:tcPr>
+            <w:tcW w:w="1954" w:type="dxa"/>
           </w:tcPr>
           <w:p>
             <w:pPr>
@@ -1876,161 +1864,161 @@
         </w:trPr>
         <w:tc>
           <w:tcPr>
-            <w:tcW w:w="799" w:type="dxa"/>
-          </w:tcPr>
-          <w:p>
-            <w:pPr>
-              <w:jc w:val="center"/>
-              <w:rPr>
-                <w:rtl/>
-              </w:rPr>
-            </w:pPr>
-          </w:p>
-        </w:tc>
-        <w:tc>
-          <w:tcPr>
-            <w:tcW w:w="1310" w:type="dxa"/>
-          </w:tcPr>
-          <w:p>
-            <w:pPr>
-              <w:tabs>
-                <w:tab w:val="center" w:pos="1812"/>
-                <w:tab w:val="left" w:pos="5592"/>
-              </w:tabs>
-              <w:spacing w:line="276" w:lineRule="auto"/>
-              <w:rPr>
-                <w:rFonts w:ascii="Traditional Arabic" w:hAnsi="Traditional Arabic" w:cs="Traditional Arabic"/>
-                <w:rtl/>
-                <w:lang w:bidi="ar-MA"/>
-              </w:rPr>
-            </w:pPr>
-          </w:p>
-        </w:tc>
-        <w:tc>
-          <w:tcPr>
-            <w:tcW w:w="569" w:type="dxa"/>
-          </w:tcPr>
-          <w:p>
-            <w:pPr>
-              <w:tabs>
-                <w:tab w:val="center" w:pos="1812"/>
-                <w:tab w:val="left" w:pos="5592"/>
-              </w:tabs>
-              <w:spacing w:line="276" w:lineRule="auto"/>
-              <w:jc w:val="center"/>
-              <w:rPr>
-                <w:rFonts w:ascii="Traditional Arabic" w:hAnsi="Traditional Arabic" w:cs="Traditional Arabic"/>
-                <w:rtl/>
-                <w:lang w:bidi="ar-MA"/>
-              </w:rPr>
-            </w:pPr>
-          </w:p>
-        </w:tc>
-        <w:tc>
-          <w:tcPr>
-            <w:tcW w:w="822" w:type="dxa"/>
-          </w:tcPr>
-          <w:p>
-            <w:pPr>
-              <w:tabs>
-                <w:tab w:val="center" w:pos="1812"/>
-                <w:tab w:val="left" w:pos="5592"/>
-              </w:tabs>
-              <w:spacing w:line="276" w:lineRule="auto"/>
-              <w:jc w:val="center"/>
-              <w:rPr>
-                <w:rFonts w:ascii="Traditional Arabic" w:hAnsi="Traditional Arabic" w:cs="Traditional Arabic"/>
-                <w:rtl/>
-                <w:lang w:bidi="ar-MA"/>
-              </w:rPr>
-            </w:pPr>
-          </w:p>
-        </w:tc>
-        <w:tc>
-          <w:tcPr>
-            <w:tcW w:w="1288" w:type="dxa"/>
-          </w:tcPr>
-          <w:p>
-            <w:pPr>
-              <w:tabs>
-                <w:tab w:val="center" w:pos="1812"/>
-                <w:tab w:val="left" w:pos="5592"/>
-              </w:tabs>
-              <w:spacing w:line="276" w:lineRule="auto"/>
-              <w:rPr>
-                <w:rFonts w:ascii="Traditional Arabic" w:hAnsi="Traditional Arabic" w:cs="Traditional Arabic"/>
-                <w:rtl/>
-                <w:lang w:bidi="ar-MA"/>
-              </w:rPr>
-            </w:pPr>
-          </w:p>
-        </w:tc>
-        <w:tc>
-          <w:tcPr>
-            <w:tcW w:w="687" w:type="dxa"/>
-          </w:tcPr>
-          <w:p>
-            <w:pPr>
-              <w:jc w:val="center"/>
-            </w:pPr>
-          </w:p>
-        </w:tc>
-        <w:tc>
-          <w:tcPr>
-            <w:tcW w:w="948" w:type="dxa"/>
-          </w:tcPr>
-          <w:p>
-            <w:pPr>
-              <w:jc w:val="center"/>
-              <w:rPr>
-                <w:rtl/>
-              </w:rPr>
-            </w:pPr>
-          </w:p>
-        </w:tc>
-        <w:tc>
-          <w:tcPr>
-            <w:tcW w:w="1060" w:type="dxa"/>
-          </w:tcPr>
-          <w:p>
-            <w:pPr>
-              <w:tabs>
-                <w:tab w:val="center" w:pos="1812"/>
-                <w:tab w:val="left" w:pos="5592"/>
-              </w:tabs>
-              <w:spacing w:line="276" w:lineRule="auto"/>
-              <w:jc w:val="center"/>
-              <w:rPr>
-                <w:rFonts w:ascii="Traditional Arabic" w:hAnsi="Traditional Arabic" w:cs="Traditional Arabic"/>
-                <w:rtl/>
-                <w:lang w:bidi="ar-MA"/>
-              </w:rPr>
-            </w:pPr>
-          </w:p>
-        </w:tc>
-        <w:tc>
-          <w:tcPr>
-            <w:tcW w:w="1369" w:type="dxa"/>
-          </w:tcPr>
-          <w:p>
-            <w:pPr>
-              <w:tabs>
-                <w:tab w:val="center" w:pos="1812"/>
-                <w:tab w:val="left" w:pos="5592"/>
-              </w:tabs>
-              <w:spacing w:line="276" w:lineRule="auto"/>
-              <w:jc w:val="center"/>
-              <w:rPr>
-                <w:rFonts w:ascii="Traditional Arabic" w:hAnsi="Traditional Arabic" w:cs="Traditional Arabic"/>
-                <w:rtl/>
-                <w:lang w:bidi="ar-MA"/>
-              </w:rPr>
-            </w:pPr>
-          </w:p>
-        </w:tc>
-        <w:tc>
-          <w:tcPr>
-            <w:tcW w:w="1644" w:type="dxa"/>
+            <w:tcW w:w="660" w:type="dxa"/>
+          </w:tcPr>
+          <w:p>
+            <w:pPr>
+              <w:jc w:val="center"/>
+              <w:rPr>
+                <w:rtl/>
+              </w:rPr>
+            </w:pPr>
+          </w:p>
+        </w:tc>
+        <w:tc>
+          <w:tcPr>
+            <w:tcW w:w="1094" w:type="dxa"/>
+          </w:tcPr>
+          <w:p>
+            <w:pPr>
+              <w:tabs>
+                <w:tab w:val="center" w:pos="1812"/>
+                <w:tab w:val="left" w:pos="5592"/>
+              </w:tabs>
+              <w:spacing w:line="276" w:lineRule="auto"/>
+              <w:rPr>
+                <w:rFonts w:ascii="Traditional Arabic" w:hAnsi="Traditional Arabic" w:cs="Traditional Arabic"/>
+                <w:rtl/>
+                <w:lang w:bidi="ar-MA"/>
+              </w:rPr>
+            </w:pPr>
+          </w:p>
+        </w:tc>
+        <w:tc>
+          <w:tcPr>
+            <w:tcW w:w="565" w:type="dxa"/>
+          </w:tcPr>
+          <w:p>
+            <w:pPr>
+              <w:tabs>
+                <w:tab w:val="center" w:pos="1812"/>
+                <w:tab w:val="left" w:pos="5592"/>
+              </w:tabs>
+              <w:spacing w:line="276" w:lineRule="auto"/>
+              <w:jc w:val="center"/>
+              <w:rPr>
+                <w:rFonts w:ascii="Traditional Arabic" w:hAnsi="Traditional Arabic" w:cs="Traditional Arabic"/>
+                <w:rtl/>
+                <w:lang w:bidi="ar-MA"/>
+              </w:rPr>
+            </w:pPr>
+          </w:p>
+        </w:tc>
+        <w:tc>
+          <w:tcPr>
+            <w:tcW w:w="813" w:type="dxa"/>
+          </w:tcPr>
+          <w:p>
+            <w:pPr>
+              <w:tabs>
+                <w:tab w:val="center" w:pos="1812"/>
+                <w:tab w:val="left" w:pos="5592"/>
+              </w:tabs>
+              <w:spacing w:line="276" w:lineRule="auto"/>
+              <w:jc w:val="center"/>
+              <w:rPr>
+                <w:rFonts w:ascii="Traditional Arabic" w:hAnsi="Traditional Arabic" w:cs="Traditional Arabic"/>
+                <w:rtl/>
+                <w:lang w:bidi="ar-MA"/>
+              </w:rPr>
+            </w:pPr>
+          </w:p>
+        </w:tc>
+        <w:tc>
+          <w:tcPr>
+            <w:tcW w:w="997" w:type="dxa"/>
+          </w:tcPr>
+          <w:p>
+            <w:pPr>
+              <w:tabs>
+                <w:tab w:val="center" w:pos="1812"/>
+                <w:tab w:val="left" w:pos="5592"/>
+              </w:tabs>
+              <w:spacing w:line="276" w:lineRule="auto"/>
+              <w:rPr>
+                <w:rFonts w:ascii="Traditional Arabic" w:hAnsi="Traditional Arabic" w:cs="Traditional Arabic"/>
+                <w:rtl/>
+                <w:lang w:bidi="ar-MA"/>
+              </w:rPr>
+            </w:pPr>
+          </w:p>
+        </w:tc>
+        <w:tc>
+          <w:tcPr>
+            <w:tcW w:w="1488" w:type="dxa"/>
+          </w:tcPr>
+          <w:p>
+            <w:pPr>
+              <w:jc w:val="center"/>
+            </w:pPr>
+          </w:p>
+        </w:tc>
+        <w:tc>
+          <w:tcPr>
+            <w:tcW w:w="1287" w:type="dxa"/>
+          </w:tcPr>
+          <w:p>
+            <w:pPr>
+              <w:jc w:val="center"/>
+              <w:rPr>
+                <w:rtl/>
+              </w:rPr>
+            </w:pPr>
+          </w:p>
+        </w:tc>
+        <w:tc>
+          <w:tcPr>
+            <w:tcW w:w="795" w:type="dxa"/>
+          </w:tcPr>
+          <w:p>
+            <w:pPr>
+              <w:tabs>
+                <w:tab w:val="center" w:pos="1812"/>
+                <w:tab w:val="left" w:pos="5592"/>
+              </w:tabs>
+              <w:spacing w:line="276" w:lineRule="auto"/>
+              <w:jc w:val="center"/>
+              <w:rPr>
+                <w:rFonts w:ascii="Traditional Arabic" w:hAnsi="Traditional Arabic" w:cs="Traditional Arabic"/>
+                <w:rtl/>
+                <w:lang w:bidi="ar-MA"/>
+              </w:rPr>
+            </w:pPr>
+          </w:p>
+        </w:tc>
+        <w:tc>
+          <w:tcPr>
+            <w:tcW w:w="843" w:type="dxa"/>
+          </w:tcPr>
+          <w:p>
+            <w:pPr>
+              <w:tabs>
+                <w:tab w:val="center" w:pos="1812"/>
+                <w:tab w:val="left" w:pos="5592"/>
+              </w:tabs>
+              <w:spacing w:line="276" w:lineRule="auto"/>
+              <w:jc w:val="center"/>
+              <w:rPr>
+                <w:rFonts w:ascii="Traditional Arabic" w:hAnsi="Traditional Arabic" w:cs="Traditional Arabic"/>
+                <w:rtl/>
+                <w:lang w:bidi="ar-MA"/>
+              </w:rPr>
+            </w:pPr>
+          </w:p>
+        </w:tc>
+        <w:tc>
+          <w:tcPr>
+            <w:tcW w:w="1954" w:type="dxa"/>
           </w:tcPr>
           <w:p>
             <w:pPr>
@@ -2055,170 +2043,170 @@
         </w:trPr>
         <w:tc>
           <w:tcPr>
-            <w:tcW w:w="799" w:type="dxa"/>
-          </w:tcPr>
-          <w:p>
-            <w:pPr>
-              <w:jc w:val="center"/>
-              <w:rPr>
-                <w:rFonts w:ascii="Traditional Arabic" w:hAnsi="Traditional Arabic" w:cs="Traditional Arabic"/>
-                <w:rtl/>
-                <w:lang w:bidi="ar-MA"/>
-              </w:rPr>
-            </w:pPr>
-          </w:p>
-        </w:tc>
-        <w:tc>
-          <w:tcPr>
-            <w:tcW w:w="1310" w:type="dxa"/>
-          </w:tcPr>
-          <w:p>
-            <w:pPr>
-              <w:tabs>
-                <w:tab w:val="center" w:pos="1812"/>
-                <w:tab w:val="left" w:pos="5592"/>
-              </w:tabs>
-              <w:spacing w:line="276" w:lineRule="auto"/>
-              <w:rPr>
-                <w:rFonts w:ascii="Traditional Arabic" w:hAnsi="Traditional Arabic" w:cs="Traditional Arabic"/>
-                <w:rtl/>
-                <w:lang w:bidi="ar-MA"/>
-              </w:rPr>
-            </w:pPr>
-          </w:p>
-        </w:tc>
-        <w:tc>
-          <w:tcPr>
-            <w:tcW w:w="569" w:type="dxa"/>
-          </w:tcPr>
-          <w:p>
-            <w:pPr>
-              <w:tabs>
-                <w:tab w:val="center" w:pos="1812"/>
-                <w:tab w:val="left" w:pos="5592"/>
-              </w:tabs>
-              <w:spacing w:line="276" w:lineRule="auto"/>
-              <w:jc w:val="center"/>
-              <w:rPr>
-                <w:rFonts w:ascii="Traditional Arabic" w:hAnsi="Traditional Arabic" w:cs="Traditional Arabic"/>
-                <w:rtl/>
-                <w:lang w:bidi="ar-MA"/>
-              </w:rPr>
-            </w:pPr>
-          </w:p>
-        </w:tc>
-        <w:tc>
-          <w:tcPr>
-            <w:tcW w:w="822" w:type="dxa"/>
-          </w:tcPr>
-          <w:p>
-            <w:pPr>
-              <w:tabs>
-                <w:tab w:val="center" w:pos="1812"/>
-                <w:tab w:val="left" w:pos="5592"/>
-              </w:tabs>
-              <w:spacing w:line="276" w:lineRule="auto"/>
-              <w:jc w:val="center"/>
-              <w:rPr>
-                <w:rFonts w:ascii="Traditional Arabic" w:hAnsi="Traditional Arabic" w:cs="Traditional Arabic"/>
-                <w:rtl/>
-                <w:lang w:bidi="ar-MA"/>
-              </w:rPr>
-            </w:pPr>
-          </w:p>
-        </w:tc>
-        <w:tc>
-          <w:tcPr>
-            <w:tcW w:w="1288" w:type="dxa"/>
-          </w:tcPr>
-          <w:p>
-            <w:pPr>
-              <w:tabs>
-                <w:tab w:val="center" w:pos="1812"/>
-                <w:tab w:val="left" w:pos="5592"/>
-              </w:tabs>
-              <w:spacing w:line="276" w:lineRule="auto"/>
-              <w:rPr>
-                <w:rFonts w:ascii="Traditional Arabic" w:hAnsi="Traditional Arabic" w:cs="Traditional Arabic"/>
-                <w:rtl/>
-                <w:lang w:bidi="ar-MA"/>
-              </w:rPr>
-            </w:pPr>
-          </w:p>
-        </w:tc>
-        <w:tc>
-          <w:tcPr>
-            <w:tcW w:w="687" w:type="dxa"/>
-          </w:tcPr>
-          <w:p>
-            <w:pPr>
-              <w:jc w:val="center"/>
-              <w:rPr>
-                <w:rFonts w:ascii="Traditional Arabic" w:hAnsi="Traditional Arabic" w:cs="Traditional Arabic"/>
-                <w:rtl/>
-                <w:lang w:bidi="ar-MA"/>
-              </w:rPr>
-            </w:pPr>
-          </w:p>
-        </w:tc>
-        <w:tc>
-          <w:tcPr>
-            <w:tcW w:w="948" w:type="dxa"/>
-          </w:tcPr>
-          <w:p>
-            <w:pPr>
-              <w:jc w:val="center"/>
-              <w:rPr>
-                <w:rFonts w:ascii="Traditional Arabic" w:hAnsi="Traditional Arabic" w:cs="Traditional Arabic"/>
-                <w:rtl/>
-                <w:lang w:bidi="ar-MA"/>
-              </w:rPr>
-            </w:pPr>
-          </w:p>
-        </w:tc>
-        <w:tc>
-          <w:tcPr>
-            <w:tcW w:w="1060" w:type="dxa"/>
-          </w:tcPr>
-          <w:p>
-            <w:pPr>
-              <w:tabs>
-                <w:tab w:val="center" w:pos="1812"/>
-                <w:tab w:val="left" w:pos="5592"/>
-              </w:tabs>
-              <w:spacing w:line="276" w:lineRule="auto"/>
-              <w:jc w:val="center"/>
-              <w:rPr>
-                <w:rFonts w:ascii="Traditional Arabic" w:hAnsi="Traditional Arabic" w:cs="Traditional Arabic"/>
-                <w:rtl/>
-                <w:lang w:bidi="ar-MA"/>
-              </w:rPr>
-            </w:pPr>
-          </w:p>
-        </w:tc>
-        <w:tc>
-          <w:tcPr>
-            <w:tcW w:w="1369" w:type="dxa"/>
-          </w:tcPr>
-          <w:p>
-            <w:pPr>
-              <w:tabs>
-                <w:tab w:val="center" w:pos="1812"/>
-                <w:tab w:val="left" w:pos="5592"/>
-              </w:tabs>
-              <w:spacing w:line="276" w:lineRule="auto"/>
-              <w:jc w:val="center"/>
-              <w:rPr>
-                <w:rFonts w:ascii="Traditional Arabic" w:hAnsi="Traditional Arabic" w:cs="Traditional Arabic"/>
-                <w:rtl/>
-                <w:lang w:bidi="ar-MA"/>
-              </w:rPr>
-            </w:pPr>
-          </w:p>
-        </w:tc>
-        <w:tc>
-          <w:tcPr>
-            <w:tcW w:w="1644" w:type="dxa"/>
+            <w:tcW w:w="660" w:type="dxa"/>
+          </w:tcPr>
+          <w:p>
+            <w:pPr>
+              <w:jc w:val="center"/>
+              <w:rPr>
+                <w:rFonts w:ascii="Traditional Arabic" w:hAnsi="Traditional Arabic" w:cs="Traditional Arabic"/>
+                <w:rtl/>
+                <w:lang w:bidi="ar-MA"/>
+              </w:rPr>
+            </w:pPr>
+          </w:p>
+        </w:tc>
+        <w:tc>
+          <w:tcPr>
+            <w:tcW w:w="1094" w:type="dxa"/>
+          </w:tcPr>
+          <w:p>
+            <w:pPr>
+              <w:tabs>
+                <w:tab w:val="center" w:pos="1812"/>
+                <w:tab w:val="left" w:pos="5592"/>
+              </w:tabs>
+              <w:spacing w:line="276" w:lineRule="auto"/>
+              <w:rPr>
+                <w:rFonts w:ascii="Traditional Arabic" w:hAnsi="Traditional Arabic" w:cs="Traditional Arabic"/>
+                <w:rtl/>
+                <w:lang w:bidi="ar-MA"/>
+              </w:rPr>
+            </w:pPr>
+          </w:p>
+        </w:tc>
+        <w:tc>
+          <w:tcPr>
+            <w:tcW w:w="565" w:type="dxa"/>
+          </w:tcPr>
+          <w:p>
+            <w:pPr>
+              <w:tabs>
+                <w:tab w:val="center" w:pos="1812"/>
+                <w:tab w:val="left" w:pos="5592"/>
+              </w:tabs>
+              <w:spacing w:line="276" w:lineRule="auto"/>
+              <w:jc w:val="center"/>
+              <w:rPr>
+                <w:rFonts w:ascii="Traditional Arabic" w:hAnsi="Traditional Arabic" w:cs="Traditional Arabic"/>
+                <w:rtl/>
+                <w:lang w:bidi="ar-MA"/>
+              </w:rPr>
+            </w:pPr>
+          </w:p>
+        </w:tc>
+        <w:tc>
+          <w:tcPr>
+            <w:tcW w:w="813" w:type="dxa"/>
+          </w:tcPr>
+          <w:p>
+            <w:pPr>
+              <w:tabs>
+                <w:tab w:val="center" w:pos="1812"/>
+                <w:tab w:val="left" w:pos="5592"/>
+              </w:tabs>
+              <w:spacing w:line="276" w:lineRule="auto"/>
+              <w:jc w:val="center"/>
+              <w:rPr>
+                <w:rFonts w:ascii="Traditional Arabic" w:hAnsi="Traditional Arabic" w:cs="Traditional Arabic"/>
+                <w:rtl/>
+                <w:lang w:bidi="ar-MA"/>
+              </w:rPr>
+            </w:pPr>
+          </w:p>
+        </w:tc>
+        <w:tc>
+          <w:tcPr>
+            <w:tcW w:w="997" w:type="dxa"/>
+          </w:tcPr>
+          <w:p>
+            <w:pPr>
+              <w:tabs>
+                <w:tab w:val="center" w:pos="1812"/>
+                <w:tab w:val="left" w:pos="5592"/>
+              </w:tabs>
+              <w:spacing w:line="276" w:lineRule="auto"/>
+              <w:rPr>
+                <w:rFonts w:ascii="Traditional Arabic" w:hAnsi="Traditional Arabic" w:cs="Traditional Arabic"/>
+                <w:rtl/>
+                <w:lang w:bidi="ar-MA"/>
+              </w:rPr>
+            </w:pPr>
+          </w:p>
+        </w:tc>
+        <w:tc>
+          <w:tcPr>
+            <w:tcW w:w="1488" w:type="dxa"/>
+          </w:tcPr>
+          <w:p>
+            <w:pPr>
+              <w:jc w:val="center"/>
+              <w:rPr>
+                <w:rFonts w:ascii="Traditional Arabic" w:hAnsi="Traditional Arabic" w:cs="Traditional Arabic"/>
+                <w:rtl/>
+                <w:lang w:bidi="ar-MA"/>
+              </w:rPr>
+            </w:pPr>
+          </w:p>
+        </w:tc>
+        <w:tc>
+          <w:tcPr>
+            <w:tcW w:w="1287" w:type="dxa"/>
+          </w:tcPr>
+          <w:p>
+            <w:pPr>
+              <w:jc w:val="center"/>
+              <w:rPr>
+                <w:rFonts w:ascii="Traditional Arabic" w:hAnsi="Traditional Arabic" w:cs="Traditional Arabic"/>
+                <w:rtl/>
+                <w:lang w:bidi="ar-MA"/>
+              </w:rPr>
+            </w:pPr>
+          </w:p>
+        </w:tc>
+        <w:tc>
+          <w:tcPr>
+            <w:tcW w:w="795" w:type="dxa"/>
+          </w:tcPr>
+          <w:p>
+            <w:pPr>
+              <w:tabs>
+                <w:tab w:val="center" w:pos="1812"/>
+                <w:tab w:val="left" w:pos="5592"/>
+              </w:tabs>
+              <w:spacing w:line="276" w:lineRule="auto"/>
+              <w:jc w:val="center"/>
+              <w:rPr>
+                <w:rFonts w:ascii="Traditional Arabic" w:hAnsi="Traditional Arabic" w:cs="Traditional Arabic"/>
+                <w:rtl/>
+                <w:lang w:bidi="ar-MA"/>
+              </w:rPr>
+            </w:pPr>
+          </w:p>
+        </w:tc>
+        <w:tc>
+          <w:tcPr>
+            <w:tcW w:w="843" w:type="dxa"/>
+          </w:tcPr>
+          <w:p>
+            <w:pPr>
+              <w:tabs>
+                <w:tab w:val="center" w:pos="1812"/>
+                <w:tab w:val="left" w:pos="5592"/>
+              </w:tabs>
+              <w:spacing w:line="276" w:lineRule="auto"/>
+              <w:jc w:val="center"/>
+              <w:rPr>
+                <w:rFonts w:ascii="Traditional Arabic" w:hAnsi="Traditional Arabic" w:cs="Traditional Arabic"/>
+                <w:rtl/>
+                <w:lang w:bidi="ar-MA"/>
+              </w:rPr>
+            </w:pPr>
+          </w:p>
+        </w:tc>
+        <w:tc>
+          <w:tcPr>
+            <w:tcW w:w="1954" w:type="dxa"/>
           </w:tcPr>
           <w:p>
             <w:pPr>
@@ -2243,100 +2231,100 @@
         </w:trPr>
         <w:tc>
           <w:tcPr>
-            <w:tcW w:w="799" w:type="dxa"/>
-          </w:tcPr>
-          <w:p>
-            <w:pPr>
-              <w:jc w:val="center"/>
-              <w:rPr>
-                <w:rFonts w:ascii="Traditional Arabic" w:hAnsi="Traditional Arabic" w:cs="Traditional Arabic"/>
-                <w:rtl/>
-                <w:lang w:bidi="ar-MA"/>
-              </w:rPr>
-            </w:pPr>
-          </w:p>
-        </w:tc>
-        <w:tc>
-          <w:tcPr>
-            <w:tcW w:w="1310" w:type="dxa"/>
-          </w:tcPr>
-          <w:p>
-            <w:pPr>
-              <w:tabs>
-                <w:tab w:val="center" w:pos="1812"/>
-                <w:tab w:val="left" w:pos="5592"/>
-              </w:tabs>
-              <w:spacing w:line="276" w:lineRule="auto"/>
-              <w:rPr>
-                <w:rFonts w:ascii="Traditional Arabic" w:hAnsi="Traditional Arabic" w:cs="Traditional Arabic"/>
-                <w:rtl/>
-                <w:lang w:bidi="ar-MA"/>
-              </w:rPr>
-            </w:pPr>
-          </w:p>
-        </w:tc>
-        <w:tc>
-          <w:tcPr>
-            <w:tcW w:w="569" w:type="dxa"/>
-          </w:tcPr>
-          <w:p>
-            <w:pPr>
-              <w:tabs>
-                <w:tab w:val="center" w:pos="1812"/>
-                <w:tab w:val="left" w:pos="5592"/>
-              </w:tabs>
-              <w:spacing w:line="276" w:lineRule="auto"/>
-              <w:jc w:val="center"/>
-              <w:rPr>
-                <w:rFonts w:ascii="Traditional Arabic" w:hAnsi="Traditional Arabic" w:cs="Traditional Arabic"/>
-                <w:rtl/>
-                <w:lang w:bidi="ar-MA"/>
-              </w:rPr>
-            </w:pPr>
-          </w:p>
-        </w:tc>
-        <w:tc>
-          <w:tcPr>
-            <w:tcW w:w="822" w:type="dxa"/>
-          </w:tcPr>
-          <w:p>
-            <w:pPr>
-              <w:tabs>
-                <w:tab w:val="center" w:pos="1812"/>
-                <w:tab w:val="left" w:pos="5592"/>
-              </w:tabs>
-              <w:spacing w:line="276" w:lineRule="auto"/>
-              <w:jc w:val="center"/>
-              <w:rPr>
-                <w:rFonts w:ascii="Traditional Arabic" w:hAnsi="Traditional Arabic" w:cs="Traditional Arabic"/>
-                <w:rtl/>
-                <w:lang w:bidi="ar-MA"/>
-              </w:rPr>
-            </w:pPr>
-          </w:p>
-        </w:tc>
-        <w:tc>
-          <w:tcPr>
-            <w:tcW w:w="1288" w:type="dxa"/>
-          </w:tcPr>
-          <w:p>
-            <w:pPr>
-              <w:tabs>
-                <w:tab w:val="center" w:pos="1812"/>
-                <w:tab w:val="left" w:pos="5592"/>
-              </w:tabs>
-              <w:spacing w:line="276" w:lineRule="auto"/>
-              <w:rPr>
-                <w:rFonts w:ascii="Traditional Arabic" w:hAnsi="Traditional Arabic" w:cs="Traditional Arabic"/>
-                <w:rtl/>
-                <w:lang w:bidi="ar-MA"/>
-              </w:rPr>
-            </w:pPr>
-          </w:p>
-        </w:tc>
-        <w:tc>
-          <w:tcPr>
-            <w:tcW w:w="687" w:type="dxa"/>
+            <w:tcW w:w="660" w:type="dxa"/>
+          </w:tcPr>
+          <w:p>
+            <w:pPr>
+              <w:jc w:val="center"/>
+              <w:rPr>
+                <w:rFonts w:ascii="Traditional Arabic" w:hAnsi="Traditional Arabic" w:cs="Traditional Arabic"/>
+                <w:rtl/>
+                <w:lang w:bidi="ar-MA"/>
+              </w:rPr>
+            </w:pPr>
+          </w:p>
+        </w:tc>
+        <w:tc>
+          <w:tcPr>
+            <w:tcW w:w="1094" w:type="dxa"/>
+          </w:tcPr>
+          <w:p>
+            <w:pPr>
+              <w:tabs>
+                <w:tab w:val="center" w:pos="1812"/>
+                <w:tab w:val="left" w:pos="5592"/>
+              </w:tabs>
+              <w:spacing w:line="276" w:lineRule="auto"/>
+              <w:rPr>
+                <w:rFonts w:ascii="Traditional Arabic" w:hAnsi="Traditional Arabic" w:cs="Traditional Arabic"/>
+                <w:rtl/>
+                <w:lang w:bidi="ar-MA"/>
+              </w:rPr>
+            </w:pPr>
+          </w:p>
+        </w:tc>
+        <w:tc>
+          <w:tcPr>
+            <w:tcW w:w="565" w:type="dxa"/>
+          </w:tcPr>
+          <w:p>
+            <w:pPr>
+              <w:tabs>
+                <w:tab w:val="center" w:pos="1812"/>
+                <w:tab w:val="left" w:pos="5592"/>
+              </w:tabs>
+              <w:spacing w:line="276" w:lineRule="auto"/>
+              <w:jc w:val="center"/>
+              <w:rPr>
+                <w:rFonts w:ascii="Traditional Arabic" w:hAnsi="Traditional Arabic" w:cs="Traditional Arabic"/>
+                <w:rtl/>
+                <w:lang w:bidi="ar-MA"/>
+              </w:rPr>
+            </w:pPr>
+          </w:p>
+        </w:tc>
+        <w:tc>
+          <w:tcPr>
+            <w:tcW w:w="813" w:type="dxa"/>
+          </w:tcPr>
+          <w:p>
+            <w:pPr>
+              <w:tabs>
+                <w:tab w:val="center" w:pos="1812"/>
+                <w:tab w:val="left" w:pos="5592"/>
+              </w:tabs>
+              <w:spacing w:line="276" w:lineRule="auto"/>
+              <w:jc w:val="center"/>
+              <w:rPr>
+                <w:rFonts w:ascii="Traditional Arabic" w:hAnsi="Traditional Arabic" w:cs="Traditional Arabic"/>
+                <w:rtl/>
+                <w:lang w:bidi="ar-MA"/>
+              </w:rPr>
+            </w:pPr>
+          </w:p>
+        </w:tc>
+        <w:tc>
+          <w:tcPr>
+            <w:tcW w:w="997" w:type="dxa"/>
+          </w:tcPr>
+          <w:p>
+            <w:pPr>
+              <w:tabs>
+                <w:tab w:val="center" w:pos="1812"/>
+                <w:tab w:val="left" w:pos="5592"/>
+              </w:tabs>
+              <w:spacing w:line="276" w:lineRule="auto"/>
+              <w:rPr>
+                <w:rFonts w:ascii="Traditional Arabic" w:hAnsi="Traditional Arabic" w:cs="Traditional Arabic"/>
+                <w:rtl/>
+                <w:lang w:bidi="ar-MA"/>
+              </w:rPr>
+            </w:pPr>
+          </w:p>
+        </w:tc>
+        <w:tc>
+          <w:tcPr>
+            <w:tcW w:w="1488" w:type="dxa"/>
           </w:tcPr>
           <w:p>
             <w:pPr>
@@ -2361,62 +2349,62 @@
         </w:tc>
         <w:tc>
           <w:tcPr>
-            <w:tcW w:w="948" w:type="dxa"/>
-          </w:tcPr>
-          <w:p>
-            <w:pPr>
-              <w:jc w:val="center"/>
-              <w:rPr>
-                <w:rFonts w:ascii="Traditional Arabic" w:hAnsi="Traditional Arabic" w:cs="Traditional Arabic"/>
-                <w:rtl/>
-                <w:lang w:bidi="ar-MA"/>
-              </w:rPr>
-            </w:pPr>
-          </w:p>
-        </w:tc>
-        <w:tc>
-          <w:tcPr>
-            <w:tcW w:w="1060" w:type="dxa"/>
-          </w:tcPr>
-          <w:p>
-            <w:pPr>
-              <w:tabs>
-                <w:tab w:val="center" w:pos="1812"/>
-                <w:tab w:val="left" w:pos="5592"/>
-              </w:tabs>
-              <w:spacing w:line="276" w:lineRule="auto"/>
-              <w:jc w:val="center"/>
-              <w:rPr>
-                <w:rFonts w:ascii="Traditional Arabic" w:hAnsi="Traditional Arabic" w:cs="Traditional Arabic"/>
-                <w:rtl/>
-                <w:lang w:bidi="ar-MA"/>
-              </w:rPr>
-            </w:pPr>
-          </w:p>
-        </w:tc>
-        <w:tc>
-          <w:tcPr>
-            <w:tcW w:w="1369" w:type="dxa"/>
-          </w:tcPr>
-          <w:p>
-            <w:pPr>
-              <w:tabs>
-                <w:tab w:val="center" w:pos="1812"/>
-                <w:tab w:val="left" w:pos="5592"/>
-              </w:tabs>
-              <w:spacing w:line="276" w:lineRule="auto"/>
-              <w:jc w:val="center"/>
-              <w:rPr>
-                <w:rFonts w:ascii="Traditional Arabic" w:hAnsi="Traditional Arabic" w:cs="Traditional Arabic"/>
-                <w:rtl/>
-                <w:lang w:bidi="ar-MA"/>
-              </w:rPr>
-            </w:pPr>
-          </w:p>
-        </w:tc>
-        <w:tc>
-          <w:tcPr>
-            <w:tcW w:w="1644" w:type="dxa"/>
+            <w:tcW w:w="1287" w:type="dxa"/>
+          </w:tcPr>
+          <w:p>
+            <w:pPr>
+              <w:jc w:val="center"/>
+              <w:rPr>
+                <w:rFonts w:ascii="Traditional Arabic" w:hAnsi="Traditional Arabic" w:cs="Traditional Arabic"/>
+                <w:rtl/>
+                <w:lang w:bidi="ar-MA"/>
+              </w:rPr>
+            </w:pPr>
+          </w:p>
+        </w:tc>
+        <w:tc>
+          <w:tcPr>
+            <w:tcW w:w="795" w:type="dxa"/>
+          </w:tcPr>
+          <w:p>
+            <w:pPr>
+              <w:tabs>
+                <w:tab w:val="center" w:pos="1812"/>
+                <w:tab w:val="left" w:pos="5592"/>
+              </w:tabs>
+              <w:spacing w:line="276" w:lineRule="auto"/>
+              <w:jc w:val="center"/>
+              <w:rPr>
+                <w:rFonts w:ascii="Traditional Arabic" w:hAnsi="Traditional Arabic" w:cs="Traditional Arabic"/>
+                <w:rtl/>
+                <w:lang w:bidi="ar-MA"/>
+              </w:rPr>
+            </w:pPr>
+          </w:p>
+        </w:tc>
+        <w:tc>
+          <w:tcPr>
+            <w:tcW w:w="843" w:type="dxa"/>
+          </w:tcPr>
+          <w:p>
+            <w:pPr>
+              <w:tabs>
+                <w:tab w:val="center" w:pos="1812"/>
+                <w:tab w:val="left" w:pos="5592"/>
+              </w:tabs>
+              <w:spacing w:line="276" w:lineRule="auto"/>
+              <w:jc w:val="center"/>
+              <w:rPr>
+                <w:rFonts w:ascii="Traditional Arabic" w:hAnsi="Traditional Arabic" w:cs="Traditional Arabic"/>
+                <w:rtl/>
+                <w:lang w:bidi="ar-MA"/>
+              </w:rPr>
+            </w:pPr>
+          </w:p>
+        </w:tc>
+        <w:tc>
+          <w:tcPr>
+            <w:tcW w:w="1954" w:type="dxa"/>
           </w:tcPr>
           <w:p>
             <w:pPr>
@@ -2441,358 +2429,170 @@
         </w:trPr>
         <w:tc>
           <w:tcPr>
-            <w:tcW w:w="799" w:type="dxa"/>
-          </w:tcPr>
-          <w:p>
-            <w:pPr>
-              <w:jc w:val="center"/>
-              <w:rPr>
-                <w:rFonts w:ascii="Traditional Arabic" w:hAnsi="Traditional Arabic" w:cs="Traditional Arabic"/>
-                <w:rtl/>
-                <w:lang w:bidi="ar-MA"/>
-              </w:rPr>
-            </w:pPr>
-          </w:p>
-        </w:tc>
-        <w:tc>
-          <w:tcPr>
-            <w:tcW w:w="1310" w:type="dxa"/>
-          </w:tcPr>
-          <w:p>
-            <w:pPr>
-              <w:tabs>
-                <w:tab w:val="center" w:pos="1812"/>
-                <w:tab w:val="left" w:pos="5592"/>
-              </w:tabs>
-              <w:spacing w:line="276" w:lineRule="auto"/>
-              <w:rPr>
-                <w:rFonts w:ascii="Traditional Arabic" w:hAnsi="Traditional Arabic" w:cs="Traditional Arabic"/>
-                <w:rtl/>
-                <w:lang w:bidi="ar-MA"/>
-              </w:rPr>
-            </w:pPr>
-          </w:p>
-        </w:tc>
-        <w:tc>
-          <w:tcPr>
-            <w:tcW w:w="569" w:type="dxa"/>
-          </w:tcPr>
-          <w:p>
-            <w:pPr>
-              <w:tabs>
-                <w:tab w:val="center" w:pos="1812"/>
-                <w:tab w:val="left" w:pos="5592"/>
-              </w:tabs>
-              <w:spacing w:line="276" w:lineRule="auto"/>
-              <w:jc w:val="center"/>
-              <w:rPr>
-                <w:rFonts w:ascii="Traditional Arabic" w:hAnsi="Traditional Arabic" w:cs="Traditional Arabic"/>
-                <w:rtl/>
-                <w:lang w:bidi="ar-MA"/>
-              </w:rPr>
-            </w:pPr>
-          </w:p>
-        </w:tc>
-        <w:tc>
-          <w:tcPr>
-            <w:tcW w:w="822" w:type="dxa"/>
-          </w:tcPr>
-          <w:p>
-            <w:pPr>
-              <w:tabs>
-                <w:tab w:val="center" w:pos="1812"/>
-                <w:tab w:val="left" w:pos="5592"/>
-              </w:tabs>
-              <w:spacing w:line="276" w:lineRule="auto"/>
-              <w:jc w:val="center"/>
-              <w:rPr>
-                <w:rFonts w:ascii="Traditional Arabic" w:hAnsi="Traditional Arabic" w:cs="Traditional Arabic"/>
-                <w:rtl/>
-                <w:lang w:bidi="ar-MA"/>
-              </w:rPr>
-            </w:pPr>
-          </w:p>
-        </w:tc>
-        <w:tc>
-          <w:tcPr>
-            <w:tcW w:w="1288" w:type="dxa"/>
-          </w:tcPr>
-          <w:p>
-            <w:pPr>
-              <w:tabs>
-                <w:tab w:val="center" w:pos="1812"/>
-                <w:tab w:val="left" w:pos="5592"/>
-              </w:tabs>
-              <w:spacing w:line="276" w:lineRule="auto"/>
-              <w:rPr>
-                <w:rFonts w:ascii="Traditional Arabic" w:hAnsi="Traditional Arabic" w:cs="Traditional Arabic"/>
-                <w:rtl/>
-                <w:lang w:bidi="ar-MA"/>
-              </w:rPr>
-            </w:pPr>
-          </w:p>
-        </w:tc>
-        <w:tc>
-          <w:tcPr>
-            <w:tcW w:w="687" w:type="dxa"/>
-          </w:tcPr>
-          <w:p>
-            <w:pPr>
-              <w:jc w:val="center"/>
-              <w:rPr>
-                <w:rFonts w:ascii="Traditional Arabic" w:hAnsi="Traditional Arabic" w:cs="Traditional Arabic"/>
-                <w:rtl/>
-                <w:lang w:bidi="ar-MA"/>
-              </w:rPr>
-            </w:pPr>
-          </w:p>
-        </w:tc>
-        <w:tc>
-          <w:tcPr>
-            <w:tcW w:w="948" w:type="dxa"/>
-          </w:tcPr>
-          <w:p>
-            <w:pPr>
-              <w:jc w:val="center"/>
-              <w:rPr>
-                <w:rFonts w:ascii="Traditional Arabic" w:hAnsi="Traditional Arabic" w:cs="Traditional Arabic"/>
-                <w:rtl/>
-                <w:lang w:bidi="ar-MA"/>
-              </w:rPr>
-            </w:pPr>
-          </w:p>
-        </w:tc>
-        <w:tc>
-          <w:tcPr>
-            <w:tcW w:w="1060" w:type="dxa"/>
-          </w:tcPr>
-          <w:p>
-            <w:pPr>
-              <w:tabs>
-                <w:tab w:val="center" w:pos="1812"/>
-                <w:tab w:val="left" w:pos="5592"/>
-              </w:tabs>
-              <w:spacing w:line="276" w:lineRule="auto"/>
-              <w:jc w:val="center"/>
-              <w:rPr>
-                <w:rFonts w:ascii="Traditional Arabic" w:hAnsi="Traditional Arabic" w:cs="Traditional Arabic"/>
-                <w:rtl/>
-                <w:lang w:bidi="ar-MA"/>
-              </w:rPr>
-            </w:pPr>
-          </w:p>
-        </w:tc>
-        <w:tc>
-          <w:tcPr>
-            <w:tcW w:w="1369" w:type="dxa"/>
-          </w:tcPr>
-          <w:p>
-            <w:pPr>
-              <w:tabs>
-                <w:tab w:val="center" w:pos="1812"/>
-                <w:tab w:val="left" w:pos="5592"/>
-              </w:tabs>
-              <w:spacing w:line="276" w:lineRule="auto"/>
-              <w:jc w:val="center"/>
-              <w:rPr>
-                <w:rFonts w:ascii="Traditional Arabic" w:hAnsi="Traditional Arabic" w:cs="Traditional Arabic"/>
-                <w:rtl/>
-                <w:lang w:bidi="ar-MA"/>
-              </w:rPr>
-            </w:pPr>
-          </w:p>
-        </w:tc>
-        <w:tc>
-          <w:tcPr>
-            <w:tcW w:w="1644" w:type="dxa"/>
-          </w:tcPr>
-          <w:p>
-            <w:pPr>
-              <w:tabs>
-                <w:tab w:val="center" w:pos="1812"/>
-                <w:tab w:val="left" w:pos="5592"/>
-              </w:tabs>
-              <w:spacing w:line="276" w:lineRule="auto"/>
-              <w:jc w:val="center"/>
-              <w:rPr>
-                <w:rFonts w:ascii="Traditional Arabic" w:hAnsi="Traditional Arabic" w:cs="Traditional Arabic"/>
-                <w:rtl/>
-                <w:lang w:bidi="ar-MA"/>
-              </w:rPr>
-            </w:pPr>
-          </w:p>
-        </w:tc>
-      </w:tr>
-      <w:tr>
-        <w:trPr>
-          <w:trHeight w:val="718"/>
-        </w:trPr>
-        <w:tc>
-          <w:tcPr>
-            <w:tcW w:w="799" w:type="dxa"/>
-          </w:tcPr>
-          <w:p>
-            <w:pPr>
-              <w:jc w:val="center"/>
-              <w:rPr>
-                <w:rFonts w:ascii="Traditional Arabic" w:hAnsi="Traditional Arabic" w:cs="Traditional Arabic"/>
-                <w:rtl/>
-                <w:lang w:bidi="ar-MA"/>
-              </w:rPr>
-            </w:pPr>
-          </w:p>
-        </w:tc>
-        <w:tc>
-          <w:tcPr>
-            <w:tcW w:w="1310" w:type="dxa"/>
-          </w:tcPr>
-          <w:p>
-            <w:pPr>
-              <w:tabs>
-                <w:tab w:val="center" w:pos="1812"/>
-                <w:tab w:val="left" w:pos="5592"/>
-              </w:tabs>
-              <w:spacing w:line="276" w:lineRule="auto"/>
-              <w:rPr>
-                <w:rFonts w:ascii="Traditional Arabic" w:hAnsi="Traditional Arabic" w:cs="Traditional Arabic"/>
-                <w:rtl/>
-                <w:lang w:bidi="ar-MA"/>
-              </w:rPr>
-            </w:pPr>
-          </w:p>
-        </w:tc>
-        <w:tc>
-          <w:tcPr>
-            <w:tcW w:w="569" w:type="dxa"/>
-          </w:tcPr>
-          <w:p>
-            <w:pPr>
-              <w:tabs>
-                <w:tab w:val="center" w:pos="1812"/>
-                <w:tab w:val="left" w:pos="5592"/>
-              </w:tabs>
-              <w:spacing w:line="276" w:lineRule="auto"/>
-              <w:jc w:val="center"/>
-              <w:rPr>
-                <w:rFonts w:ascii="Traditional Arabic" w:hAnsi="Traditional Arabic" w:cs="Traditional Arabic"/>
-                <w:rtl/>
-                <w:lang w:bidi="ar-MA"/>
-              </w:rPr>
-            </w:pPr>
-          </w:p>
-        </w:tc>
-        <w:tc>
-          <w:tcPr>
-            <w:tcW w:w="822" w:type="dxa"/>
-          </w:tcPr>
-          <w:p>
-            <w:pPr>
-              <w:tabs>
-                <w:tab w:val="center" w:pos="1812"/>
-                <w:tab w:val="left" w:pos="5592"/>
-              </w:tabs>
-              <w:spacing w:line="276" w:lineRule="auto"/>
-              <w:jc w:val="center"/>
-              <w:rPr>
-                <w:rFonts w:ascii="Traditional Arabic" w:hAnsi="Traditional Arabic" w:cs="Traditional Arabic"/>
-                <w:rtl/>
-                <w:lang w:bidi="ar-MA"/>
-              </w:rPr>
-            </w:pPr>
-          </w:p>
-        </w:tc>
-        <w:tc>
-          <w:tcPr>
-            <w:tcW w:w="1288" w:type="dxa"/>
-          </w:tcPr>
-          <w:p>
-            <w:pPr>
-              <w:tabs>
-                <w:tab w:val="center" w:pos="1812"/>
-                <w:tab w:val="left" w:pos="5592"/>
-              </w:tabs>
-              <w:spacing w:line="276" w:lineRule="auto"/>
-              <w:rPr>
-                <w:rFonts w:ascii="Traditional Arabic" w:hAnsi="Traditional Arabic" w:cs="Traditional Arabic"/>
-                <w:rtl/>
-                <w:lang w:bidi="ar-MA"/>
-              </w:rPr>
-            </w:pPr>
-          </w:p>
-        </w:tc>
-        <w:tc>
-          <w:tcPr>
-            <w:tcW w:w="687" w:type="dxa"/>
-          </w:tcPr>
-          <w:p>
-            <w:pPr>
-              <w:jc w:val="center"/>
-              <w:rPr>
-                <w:rFonts w:ascii="Traditional Arabic" w:hAnsi="Traditional Arabic" w:cs="Traditional Arabic"/>
-                <w:rtl/>
-                <w:lang w:bidi="ar-MA"/>
-              </w:rPr>
-            </w:pPr>
-          </w:p>
-        </w:tc>
-        <w:tc>
-          <w:tcPr>
-            <w:tcW w:w="948" w:type="dxa"/>
-          </w:tcPr>
-          <w:p>
-            <w:pPr>
-              <w:jc w:val="center"/>
-              <w:rPr>
-                <w:rFonts w:ascii="Traditional Arabic" w:hAnsi="Traditional Arabic" w:cs="Traditional Arabic"/>
-                <w:rtl/>
-                <w:lang w:bidi="ar-MA"/>
-              </w:rPr>
-            </w:pPr>
-          </w:p>
-        </w:tc>
-        <w:tc>
-          <w:tcPr>
-            <w:tcW w:w="1060" w:type="dxa"/>
-          </w:tcPr>
-          <w:p>
-            <w:pPr>
-              <w:tabs>
-                <w:tab w:val="center" w:pos="1812"/>
-                <w:tab w:val="left" w:pos="5592"/>
-              </w:tabs>
-              <w:spacing w:line="276" w:lineRule="auto"/>
-              <w:jc w:val="center"/>
-              <w:rPr>
-                <w:rFonts w:ascii="Traditional Arabic" w:hAnsi="Traditional Arabic" w:cs="Traditional Arabic"/>
-                <w:rtl/>
-                <w:lang w:bidi="ar-MA"/>
-              </w:rPr>
-            </w:pPr>
-          </w:p>
-        </w:tc>
-        <w:tc>
-          <w:tcPr>
-            <w:tcW w:w="1369" w:type="dxa"/>
-          </w:tcPr>
-          <w:p>
-            <w:pPr>
-              <w:tabs>
-                <w:tab w:val="center" w:pos="1812"/>
-                <w:tab w:val="left" w:pos="5592"/>
-              </w:tabs>
-              <w:spacing w:line="276" w:lineRule="auto"/>
-              <w:jc w:val="center"/>
-              <w:rPr>
-                <w:rFonts w:ascii="Traditional Arabic" w:hAnsi="Traditional Arabic" w:cs="Traditional Arabic"/>
-                <w:rtl/>
-                <w:lang w:bidi="ar-MA"/>
-              </w:rPr>
-            </w:pPr>
-          </w:p>
-        </w:tc>
-        <w:tc>
-          <w:tcPr>
-            <w:tcW w:w="1644" w:type="dxa"/>
+            <w:tcW w:w="660" w:type="dxa"/>
+          </w:tcPr>
+          <w:p>
+            <w:pPr>
+              <w:jc w:val="center"/>
+              <w:rPr>
+                <w:rFonts w:ascii="Traditional Arabic" w:hAnsi="Traditional Arabic" w:cs="Traditional Arabic"/>
+                <w:rtl/>
+                <w:lang w:bidi="ar-MA"/>
+              </w:rPr>
+            </w:pPr>
+          </w:p>
+        </w:tc>
+        <w:tc>
+          <w:tcPr>
+            <w:tcW w:w="1094" w:type="dxa"/>
+          </w:tcPr>
+          <w:p>
+            <w:pPr>
+              <w:tabs>
+                <w:tab w:val="center" w:pos="1812"/>
+                <w:tab w:val="left" w:pos="5592"/>
+              </w:tabs>
+              <w:spacing w:line="276" w:lineRule="auto"/>
+              <w:rPr>
+                <w:rFonts w:ascii="Traditional Arabic" w:hAnsi="Traditional Arabic" w:cs="Traditional Arabic"/>
+                <w:rtl/>
+                <w:lang w:bidi="ar-MA"/>
+              </w:rPr>
+            </w:pPr>
+          </w:p>
+        </w:tc>
+        <w:tc>
+          <w:tcPr>
+            <w:tcW w:w="565" w:type="dxa"/>
+          </w:tcPr>
+          <w:p>
+            <w:pPr>
+              <w:tabs>
+                <w:tab w:val="center" w:pos="1812"/>
+                <w:tab w:val="left" w:pos="5592"/>
+              </w:tabs>
+              <w:spacing w:line="276" w:lineRule="auto"/>
+              <w:jc w:val="center"/>
+              <w:rPr>
+                <w:rFonts w:ascii="Traditional Arabic" w:hAnsi="Traditional Arabic" w:cs="Traditional Arabic"/>
+                <w:rtl/>
+                <w:lang w:bidi="ar-MA"/>
+              </w:rPr>
+            </w:pPr>
+          </w:p>
+        </w:tc>
+        <w:tc>
+          <w:tcPr>
+            <w:tcW w:w="813" w:type="dxa"/>
+          </w:tcPr>
+          <w:p>
+            <w:pPr>
+              <w:tabs>
+                <w:tab w:val="center" w:pos="1812"/>
+                <w:tab w:val="left" w:pos="5592"/>
+              </w:tabs>
+              <w:spacing w:line="276" w:lineRule="auto"/>
+              <w:jc w:val="center"/>
+              <w:rPr>
+                <w:rFonts w:ascii="Traditional Arabic" w:hAnsi="Traditional Arabic" w:cs="Traditional Arabic"/>
+                <w:rtl/>
+                <w:lang w:bidi="ar-MA"/>
+              </w:rPr>
+            </w:pPr>
+          </w:p>
+        </w:tc>
+        <w:tc>
+          <w:tcPr>
+            <w:tcW w:w="997" w:type="dxa"/>
+          </w:tcPr>
+          <w:p>
+            <w:pPr>
+              <w:tabs>
+                <w:tab w:val="center" w:pos="1812"/>
+                <w:tab w:val="left" w:pos="5592"/>
+              </w:tabs>
+              <w:spacing w:line="276" w:lineRule="auto"/>
+              <w:rPr>
+                <w:rFonts w:ascii="Traditional Arabic" w:hAnsi="Traditional Arabic" w:cs="Traditional Arabic"/>
+                <w:rtl/>
+                <w:lang w:bidi="ar-MA"/>
+              </w:rPr>
+            </w:pPr>
+          </w:p>
+        </w:tc>
+        <w:tc>
+          <w:tcPr>
+            <w:tcW w:w="1488" w:type="dxa"/>
+          </w:tcPr>
+          <w:p>
+            <w:pPr>
+              <w:jc w:val="center"/>
+              <w:rPr>
+                <w:rFonts w:ascii="Traditional Arabic" w:hAnsi="Traditional Arabic" w:cs="Traditional Arabic"/>
+                <w:rtl/>
+                <w:lang w:bidi="ar-MA"/>
+              </w:rPr>
+            </w:pPr>
+          </w:p>
+        </w:tc>
+        <w:tc>
+          <w:tcPr>
+            <w:tcW w:w="1287" w:type="dxa"/>
+          </w:tcPr>
+          <w:p>
+            <w:pPr>
+              <w:jc w:val="center"/>
+              <w:rPr>
+                <w:rFonts w:ascii="Traditional Arabic" w:hAnsi="Traditional Arabic" w:cs="Traditional Arabic"/>
+                <w:rtl/>
+                <w:lang w:bidi="ar-MA"/>
+              </w:rPr>
+            </w:pPr>
+          </w:p>
+        </w:tc>
+        <w:tc>
+          <w:tcPr>
+            <w:tcW w:w="795" w:type="dxa"/>
+          </w:tcPr>
+          <w:p>
+            <w:pPr>
+              <w:tabs>
+                <w:tab w:val="center" w:pos="1812"/>
+                <w:tab w:val="left" w:pos="5592"/>
+              </w:tabs>
+              <w:spacing w:line="276" w:lineRule="auto"/>
+              <w:jc w:val="center"/>
+              <w:rPr>
+                <w:rFonts w:ascii="Traditional Arabic" w:hAnsi="Traditional Arabic" w:cs="Traditional Arabic"/>
+                <w:rtl/>
+                <w:lang w:bidi="ar-MA"/>
+              </w:rPr>
+            </w:pPr>
+          </w:p>
+        </w:tc>
+        <w:tc>
+          <w:tcPr>
+            <w:tcW w:w="843" w:type="dxa"/>
+          </w:tcPr>
+          <w:p>
+            <w:pPr>
+              <w:tabs>
+                <w:tab w:val="center" w:pos="1812"/>
+                <w:tab w:val="left" w:pos="5592"/>
+              </w:tabs>
+              <w:spacing w:line="276" w:lineRule="auto"/>
+              <w:jc w:val="center"/>
+              <w:rPr>
+                <w:rFonts w:ascii="Traditional Arabic" w:hAnsi="Traditional Arabic" w:cs="Traditional Arabic"/>
+                <w:rtl/>
+                <w:lang w:bidi="ar-MA"/>
+              </w:rPr>
+            </w:pPr>
+          </w:p>
+        </w:tc>
+        <w:tc>
+          <w:tcPr>
+            <w:tcW w:w="1954" w:type="dxa"/>
           </w:tcPr>
           <w:p>
             <w:pPr>
@@ -2886,7 +2686,7 @@
 <w:hdr xmlns:wpc="http://schemas.microsoft.com/office/word/2010/wordprocessingCanvas" xmlns:cx="http://schemas.microsoft.com/office/drawing/2014/chartex" xmlns:cx1="http://schemas.microsoft.com/office/drawing/2015/9/8/chartex" xmlns:cx2="http://schemas.microsoft.com/office/drawing/2015/10/21/chartex" xmlns:cx3="http://schemas.microsoft.com/office/drawing/2016/5/9/chartex" xmlns:cx4="http://schemas.microsoft.com/office/drawing/2016/5/10/chartex" xmlns:cx5="http://schemas.microsoft.com/office/drawing/2016/5/11/chartex" xmlns:cx6="http://schemas.microsoft.com/office/drawing/2016/5/12/chartex" xmlns:cx7="http://schemas.microsoft.com/office/drawing/2016/5/13/chartex" xmlns:cx8="http://schemas.microsoft.com/office/drawing/2016/5/14/chartex" xmlns:mc="http://schemas.openxmlformats.org/markup-compatibility/2006" xmlns:aink="http://schemas.microsoft.com/office/drawing/2016/ink" xmlns:am3d="http://schemas.microsoft.com/office/drawing/2017/model3d" xmlns:o="urn:schemas-microsoft-com:office:office" xmlns:oel="http://schemas.microsoft.com/office/2019/extlst" xmlns:r="http://schemas.openxmlformats.org/officeDocument/2006/relationships" xmlns:m="http://schemas.openxmlformats.org/officeDocument/2006/math" xmlns:v="urn:schemas-microsoft-com:vml" xmlns:wp14="http://schemas.microsoft.com/office/word/2010/wordprocessingDrawing" xmlns:wp="http://schemas.openxmlformats.org/drawingml/2006/wordprocessingDrawing" xmlns:w10="urn:schemas-microsoft-com:office:word" xmlns:w="http://schemas.openxmlformats.org/wordprocessingml/2006/main" xmlns:w14="http://schemas.microsoft.com/office/word/2010/wordml" xmlns:w15="http://schemas.microsoft.com/office/word/2012/wordml" xmlns:w16cei="http://schemas.microsoft.com/office/word/2026/wordml/cei" xmlns:w16cex="http://schemas.microsoft.com/office/word/2018/wordml/cex" xmlns:w16cid="http://schemas.microsoft.com/office/word/2016/wordml/cid" xmlns:w16="http://schemas.microsoft.com/office/word/2018/wordml" xmlns:w16du="http://schemas.microsoft.com/office/word/2023/wordml/word16du" xmlns:w16sdtdh="http://schemas.microsoft.com/office/word/2020/wordml/sdtdatahash" xmlns:w16sdtfl="http://schemas.microsoft.com/office/word/2024/wordml/sdtformatlock" xmlns:w16se="http://schemas.microsoft.com/office/word/2015/wordml/symex" xmlns:wpg="http://schemas.microsoft.com/office/word/2010/wordprocessingGroup" xmlns:wpi="http://schemas.microsoft.com/office/word/2010/wordprocessingInk" xmlns:wne="http://schemas.microsoft.com/office/word/2006/wordml" xmlns:wps="http://schemas.microsoft.com/office/word/2010/wordprocessingShape" mc:Ignorable="w14 w15 w16se w16cid w16 w16cex w16sdtdh w16sdtfl w16du wp14">
   <w:p>
     <w:pPr>
-      <w:pStyle w:val="Titre3"/>
+      <w:pStyle w:val="Heading3"/>
       <w:spacing w:line="240" w:lineRule="auto"/>
       <w:ind w:right="6804"/>
       <w:rPr>
@@ -3039,7 +2839,7 @@
                       <w:txbxContent>
                         <w:p>
                           <w:pPr>
-                            <w:pStyle w:val="Titre3"/>
+                            <w:pStyle w:val="Heading3"/>
                             <w:ind w:hanging="11"/>
                             <w:jc w:val="left"/>
                             <w:rPr>
@@ -3088,7 +2888,7 @@
                 <w:txbxContent>
                   <w:p>
                     <w:pPr>
-                      <w:pStyle w:val="Titre3"/>
+                      <w:pStyle w:val="Heading3"/>
                       <w:ind w:hanging="11"/>
                       <w:jc w:val="left"/>
                       <w:rPr>
@@ -3129,7 +2929,7 @@
   </w:p>
   <w:p>
     <w:pPr>
-      <w:pStyle w:val="Titre3"/>
+      <w:pStyle w:val="Heading3"/>
       <w:spacing w:line="240" w:lineRule="auto"/>
       <w:ind w:right="6804"/>
       <w:rPr>
@@ -3153,7 +2953,7 @@
   </w:p>
   <w:p>
     <w:pPr>
-      <w:pStyle w:val="Titre3"/>
+      <w:pStyle w:val="Heading3"/>
       <w:spacing w:line="240" w:lineRule="auto"/>
       <w:ind w:right="6804"/>
       <w:rPr>
@@ -3164,7 +2964,6 @@
         <w:rtl/>
       </w:rPr>
     </w:pPr>
-    <w:proofErr w:type="gramStart"/>
     <w:r>
       <w:rPr>
         <w:rFonts w:cs="Traditional Arabic"/>
@@ -3175,7 +2974,6 @@
       </w:rPr>
       <w:t>المديرية  الإقليمية</w:t>
     </w:r>
-    <w:proofErr w:type="gramEnd"/>
     <w:r>
       <w:rPr>
         <w:rFonts w:cs="Traditional Arabic" w:hint="cs"/>
@@ -3189,7 +2987,7 @@
   </w:p>
   <w:p>
     <w:pPr>
-      <w:pStyle w:val="Titre3"/>
+      <w:pStyle w:val="Heading3"/>
       <w:spacing w:line="240" w:lineRule="auto"/>
       <w:ind w:right="6804"/>
       <w:rPr>
@@ -3213,7 +3011,7 @@
   </w:p>
   <w:p>
     <w:pPr>
-      <w:pStyle w:val="En-tte"/>
+      <w:pStyle w:val="Header"/>
     </w:pPr>
   </w:p>
 </w:hdr>
@@ -3223,7 +3021,7 @@
 <w:hdr xmlns:wpc="http://schemas.microsoft.com/office/word/2010/wordprocessingCanvas" xmlns:cx="http://schemas.microsoft.com/office/drawing/2014/chartex" xmlns:cx1="http://schemas.microsoft.com/office/drawing/2015/9/8/chartex" xmlns:cx2="http://schemas.microsoft.com/office/drawing/2015/10/21/chartex" xmlns:cx3="http://schemas.microsoft.com/office/drawing/2016/5/9/chartex" xmlns:cx4="http://schemas.microsoft.com/office/drawing/2016/5/10/chartex" xmlns:cx5="http://schemas.microsoft.com/office/drawing/2016/5/11/chartex" xmlns:cx6="http://schemas.microsoft.com/office/drawing/2016/5/12/chartex" xmlns:cx7="http://schemas.microsoft.com/office/drawing/2016/5/13/chartex" xmlns:cx8="http://schemas.microsoft.com/office/drawing/2016/5/14/chartex" xmlns:mc="http://schemas.openxmlformats.org/markup-compatibility/2006" xmlns:aink="http://schemas.microsoft.com/office/drawing/2016/ink" xmlns:am3d="http://schemas.microsoft.com/office/drawing/2017/model3d" xmlns:o="urn:schemas-microsoft-com:office:office" xmlns:oel="http://schemas.microsoft.com/office/2019/extlst" xmlns:r="http://schemas.openxmlformats.org/officeDocument/2006/relationships" xmlns:m="http://schemas.openxmlformats.org/officeDocument/2006/math" xmlns:v="urn:schemas-microsoft-com:vml" xmlns:wp14="http://schemas.microsoft.com/office/word/2010/wordprocessingDrawing" xmlns:wp="http://schemas.openxmlformats.org/drawingml/2006/wordprocessingDrawing" xmlns:w10="urn:schemas-microsoft-com:office:word" xmlns:w="http://schemas.openxmlformats.org/wordprocessingml/2006/main" xmlns:w14="http://schemas.microsoft.com/office/word/2010/wordml" xmlns:w15="http://schemas.microsoft.com/office/word/2012/wordml" xmlns:w16cei="http://schemas.microsoft.com/office/word/2026/wordml/cei" xmlns:w16cex="http://schemas.microsoft.com/office/word/2018/wordml/cex" xmlns:w16cid="http://schemas.microsoft.com/office/word/2016/wordml/cid" xmlns:w16="http://schemas.microsoft.com/office/word/2018/wordml" xmlns:w16du="http://schemas.microsoft.com/office/word/2023/wordml/word16du" xmlns:w16sdtdh="http://schemas.microsoft.com/office/word/2020/wordml/sdtdatahash" xmlns:w16sdtfl="http://schemas.microsoft.com/office/word/2024/wordml/sdtformatlock" xmlns:w16se="http://schemas.microsoft.com/office/word/2015/wordml/symex" xmlns:wpg="http://schemas.microsoft.com/office/word/2010/wordprocessingGroup" xmlns:wpi="http://schemas.microsoft.com/office/word/2010/wordprocessingInk" xmlns:wne="http://schemas.microsoft.com/office/word/2006/wordml" xmlns:wps="http://schemas.microsoft.com/office/word/2010/wordprocessingShape" mc:Ignorable="w14 w15 w16se w16cid w16 w16cex w16sdtdh w16sdtfl w16du wp14">
   <w:p>
     <w:pPr>
-      <w:pStyle w:val="Titre3"/>
+      <w:pStyle w:val="Heading3"/>
       <w:spacing w:line="240" w:lineRule="auto"/>
       <w:ind w:right="6804"/>
       <w:rPr>
@@ -3234,279 +3032,6 @@
         <w:rtl/>
       </w:rPr>
     </w:pPr>
-    <w:r>
-      <w:rPr>
-        <w:rFonts w:cs="Traditional Arabic"/>
-        <w:noProof/>
-        <w:sz w:val="24"/>
-        <w:szCs w:val="24"/>
-        <w:u w:val="none"/>
-        <w:rtl/>
-        <w:lang w:eastAsia="en-US" w:bidi="ar-SA"/>
-      </w:rPr>
-      <mc:AlternateContent>
-        <mc:Choice Requires="wps">
-          <w:drawing>
-            <wp:anchor distT="0" distB="0" distL="114300" distR="114300" simplePos="0" relativeHeight="251659264" behindDoc="0" locked="0" layoutInCell="1" allowOverlap="1" wp14:anchorId="445B40A9" wp14:editId="51C648B4">
-              <wp:simplePos x="0" y="0"/>
-              <wp:positionH relativeFrom="column">
-                <wp:posOffset>-252385</wp:posOffset>
-              </wp:positionH>
-              <wp:positionV relativeFrom="paragraph">
-                <wp:posOffset>50060</wp:posOffset>
-              </wp:positionV>
-              <wp:extent cx="2294505" cy="662400"/>
-              <wp:effectExtent l="0" t="0" r="0" b="4445"/>
-              <wp:wrapNone/>
-              <wp:docPr id="2" name="Text Box 1"/>
-              <wp:cNvGraphicFramePr>
-                <a:graphicFrameLocks xmlns:a="http://schemas.openxmlformats.org/drawingml/2006/main"/>
-              </wp:cNvGraphicFramePr>
-              <a:graphic xmlns:a="http://schemas.openxmlformats.org/drawingml/2006/main">
-                <a:graphicData uri="http://schemas.microsoft.com/office/word/2010/wordprocessingShape">
-                  <wps:wsp>
-                    <wps:cNvSpPr txBox="1">
-                      <a:spLocks noChangeArrowheads="1"/>
-                    </wps:cNvSpPr>
-                    <wps:spPr bwMode="auto">
-                      <a:xfrm>
-                        <a:off x="0" y="0"/>
-                        <a:ext cx="2294505" cy="662400"/>
-                      </a:xfrm>
-                      <a:prstGeom prst="rect">
-                        <a:avLst/>
-                      </a:prstGeom>
-                      <a:noFill/>
-                      <a:ln>
-                        <a:noFill/>
-                      </a:ln>
-                      <a:extLst>
-                        <a:ext uri="{909E8E84-426E-40DD-AFC4-6F175D3DCCD1}">
-                          <a14:hiddenFill xmlns:a14="http://schemas.microsoft.com/office/drawing/2010/main">
-                            <a:solidFill>
-                              <a:srgbClr val="FFFFFF"/>
-                            </a:solidFill>
-                          </a14:hiddenFill>
-                        </a:ext>
-                        <a:ext uri="{91240B29-F687-4F45-9708-019B960494DF}">
-                          <a14:hiddenLine xmlns:a14="http://schemas.microsoft.com/office/drawing/2010/main" w="9525">
-                            <a:solidFill>
-                              <a:srgbClr val="000000"/>
-                            </a:solidFill>
-                            <a:miter lim="800000"/>
-                            <a:headEnd/>
-                            <a:tailEnd/>
-                          </a14:hiddenLine>
-                        </a:ext>
-                      </a:extLst>
-                    </wps:spPr>
-                    <wps:txbx>
-                      <w:txbxContent>
-                        <w:p>
-                          <w:pPr>
-                            <w:pStyle w:val="Titre3"/>
-                            <w:ind w:left="360"/>
-                            <w:rPr>
-                              <w:rFonts w:cs="Traditional Arabic"/>
-                              <w:lang w:val="fr-FR"/>
-                            </w:rPr>
-                          </w:pPr>
-                          <w:r>
-                            <w:rPr>
-                              <w:rFonts w:cs="Traditional Arabic" w:hint="cs"/>
-                              <w:sz w:val="24"/>
-                              <w:szCs w:val="24"/>
-                              <w:u w:val="none"/>
-                              <w:rtl/>
-                            </w:rPr>
-                            <w:t xml:space="preserve">الجديدة </w:t>
-                          </w:r>
-                          <w:proofErr w:type="gramStart"/>
-                          <w:r>
-                            <w:rPr>
-                              <w:rFonts w:cs="Traditional Arabic" w:hint="cs"/>
-                              <w:sz w:val="24"/>
-                              <w:szCs w:val="24"/>
-                              <w:u w:val="none"/>
-                              <w:rtl/>
-                            </w:rPr>
-                            <w:t>في :</w:t>
-                          </w:r>
-                          <w:proofErr w:type="gramEnd"/>
-                          <w:r>
-                            <w:rPr>
-                              <w:rFonts w:cs="Traditional Arabic" w:hint="cs"/>
-                              <w:sz w:val="24"/>
-                              <w:szCs w:val="24"/>
-                              <w:u w:val="none"/>
-                              <w:rtl/>
-                            </w:rPr>
-                            <w:t xml:space="preserve"> </w:t>
-                          </w:r>
-                          <w:r>
-                            <w:rPr>
-                              <w:rFonts w:cs="Traditional Arabic"/>
-                              <w:sz w:val="20"/>
-                              <w:szCs w:val="20"/>
-                              <w:u w:val="none"/>
-                              <w:lang w:val="fr-FR"/>
-                            </w:rPr>
-                            <w:t>{</w:t>
-                          </w:r>
-                          <w:proofErr w:type="spellStart"/>
-                          <w:r>
-                            <w:rPr>
-                              <w:rFonts w:cs="Traditional Arabic"/>
-                              <w:sz w:val="20"/>
-                              <w:szCs w:val="20"/>
-                              <w:u w:val="none"/>
-                              <w:lang w:val="fr-FR"/>
-                            </w:rPr>
-                            <w:t>dateCreation</w:t>
-                          </w:r>
-                          <w:proofErr w:type="spellEnd"/>
-                          <w:r>
-                            <w:rPr>
-                              <w:rFonts w:cs="Traditional Arabic"/>
-                              <w:sz w:val="20"/>
-                              <w:szCs w:val="20"/>
-                              <w:u w:val="none"/>
-                              <w:lang w:val="fr-FR"/>
-                            </w:rPr>
-                            <w:t>}</w:t>
-                          </w:r>
-                        </w:p>
-                        <w:p>
-                          <w:pPr>
-                            <w:pStyle w:val="Titre3"/>
-                            <w:jc w:val="left"/>
-                            <w:rPr>
-                              <w:rFonts w:cs="Traditional Arabic"/>
-                              <w:sz w:val="24"/>
-                              <w:szCs w:val="24"/>
-                              <w:u w:val="none"/>
-                            </w:rPr>
-                          </w:pPr>
-                        </w:p>
-                      </w:txbxContent>
-                    </wps:txbx>
-                    <wps:bodyPr rot="0" vert="horz" wrap="square" lIns="91440" tIns="45720" rIns="91440" bIns="45720" anchor="t" anchorCtr="0" upright="1">
-                      <a:noAutofit/>
-                    </wps:bodyPr>
-                  </wps:wsp>
-                </a:graphicData>
-              </a:graphic>
-              <wp14:sizeRelH relativeFrom="margin">
-                <wp14:pctWidth>0</wp14:pctWidth>
-              </wp14:sizeRelH>
-              <wp14:sizeRelV relativeFrom="margin">
-                <wp14:pctHeight>0</wp14:pctHeight>
-              </wp14:sizeRelV>
-            </wp:anchor>
-          </w:drawing>
-        </mc:Choice>
-        <mc:Fallback>
-          <w:pict>
-            <v:shapetype w14:anchorId="445B40A9" id="_x0000_t202" coordsize="21600,21600" o:spt="202" path="m,l,21600r21600,l21600,xe">
-              <v:stroke joinstyle="miter"/>
-              <v:path gradientshapeok="t" o:connecttype="rect"/>
-            </v:shapetype>
-            <v:shape id="_x0000_s1027" type="#_x0000_t202" style="position:absolute;left:0;text-align:left;margin-left:-19.85pt;margin-top:3.95pt;width:180.65pt;height:52.15pt;z-index:251659264;visibility:visible;mso-wrap-style:square;mso-width-percent:0;mso-height-percent:0;mso-wrap-distance-left:9pt;mso-wrap-distance-top:0;mso-wrap-distance-right:9pt;mso-wrap-distance-bottom:0;mso-position-horizontal:absolute;mso-position-horizontal-relative:text;mso-position-vertical:absolute;mso-position-vertical-relative:text;mso-width-percent:0;mso-height-percent:0;mso-width-relative:margin;mso-height-relative:margin;v-text-anchor:top" o:gfxdata="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" filled="f" stroked="f">
-              <v:textbox>
-                <w:txbxContent>
-                  <w:p>
-                    <w:pPr>
-                      <w:pStyle w:val="Titre3"/>
-                      <w:ind w:left="360"/>
-                      <w:rPr>
-                        <w:rFonts w:cs="Traditional Arabic"/>
-                        <w:lang w:val="fr-FR"/>
-                      </w:rPr>
-                    </w:pPr>
-                    <w:r>
-                      <w:rPr>
-                        <w:rFonts w:cs="Traditional Arabic" w:hint="cs"/>
-                        <w:sz w:val="24"/>
-                        <w:szCs w:val="24"/>
-                        <w:u w:val="none"/>
-                        <w:rtl/>
-                      </w:rPr>
-                      <w:t xml:space="preserve">الجديدة </w:t>
-                    </w:r>
-                    <w:proofErr w:type="gramStart"/>
-                    <w:r>
-                      <w:rPr>
-                        <w:rFonts w:cs="Traditional Arabic" w:hint="cs"/>
-                        <w:sz w:val="24"/>
-                        <w:szCs w:val="24"/>
-                        <w:u w:val="none"/>
-                        <w:rtl/>
-                      </w:rPr>
-                      <w:t>في :</w:t>
-                    </w:r>
-                    <w:proofErr w:type="gramEnd"/>
-                    <w:r>
-                      <w:rPr>
-                        <w:rFonts w:cs="Traditional Arabic" w:hint="cs"/>
-                        <w:sz w:val="24"/>
-                        <w:szCs w:val="24"/>
-                        <w:u w:val="none"/>
-                        <w:rtl/>
-                      </w:rPr>
-                      <w:t xml:space="preserve"> </w:t>
-                    </w:r>
-                    <w:r>
-                      <w:rPr>
-                        <w:rFonts w:cs="Traditional Arabic"/>
-                        <w:sz w:val="20"/>
-                        <w:szCs w:val="20"/>
-                        <w:u w:val="none"/>
-                        <w:lang w:val="fr-FR"/>
-                      </w:rPr>
-                      <w:t>{</w:t>
-                    </w:r>
-                    <w:proofErr w:type="spellStart"/>
-                    <w:r>
-                      <w:rPr>
-                        <w:rFonts w:cs="Traditional Arabic"/>
-                        <w:sz w:val="20"/>
-                        <w:szCs w:val="20"/>
-                        <w:u w:val="none"/>
-                        <w:lang w:val="fr-FR"/>
-                      </w:rPr>
-                      <w:t>dateCreation</w:t>
-                    </w:r>
-                    <w:proofErr w:type="spellEnd"/>
-                    <w:r>
-                      <w:rPr>
-                        <w:rFonts w:cs="Traditional Arabic"/>
-                        <w:sz w:val="20"/>
-                        <w:szCs w:val="20"/>
-                        <w:u w:val="none"/>
-                        <w:lang w:val="fr-FR"/>
-                      </w:rPr>
-                      <w:t>}</w:t>
-                    </w:r>
-                  </w:p>
-                  <w:p>
-                    <w:pPr>
-                      <w:pStyle w:val="Titre3"/>
-                      <w:jc w:val="left"/>
-                      <w:rPr>
-                        <w:rFonts w:cs="Traditional Arabic"/>
-                        <w:sz w:val="24"/>
-                        <w:szCs w:val="24"/>
-                        <w:u w:val="none"/>
-                      </w:rPr>
-                    </w:pPr>
-                  </w:p>
-                </w:txbxContent>
-              </v:textbox>
-            </v:shape>
-          </w:pict>
-        </mc:Fallback>
-      </mc:AlternateContent>
-    </w:r>
     <w:r>
       <w:rPr>
         <w:rFonts w:ascii="Traditional Arabic" w:hAnsi="Traditional Arabic" w:cs="Traditional Arabic"/>
@@ -3517,7 +3042,7 @@
         <w:lang w:eastAsia="en-US" w:bidi="ar-SA"/>
       </w:rPr>
       <w:drawing>
-        <wp:anchor distT="0" distB="0" distL="114300" distR="114300" simplePos="0" relativeHeight="251660288" behindDoc="0" locked="0" layoutInCell="1" allowOverlap="1" wp14:anchorId="19352F3B" wp14:editId="525857BB">
+        <wp:anchor distT="0" distB="0" distL="114300" distR="114300" simplePos="0" relativeHeight="251660288" behindDoc="0" locked="0" layoutInCell="1" allowOverlap="1" wp14:anchorId="19352F3B" wp14:editId="74765385">
           <wp:simplePos x="0" y="0"/>
           <wp:positionH relativeFrom="column">
             <wp:posOffset>2787015</wp:posOffset>
@@ -3592,7 +3117,7 @@
   </w:p>
   <w:p>
     <w:pPr>
-      <w:pStyle w:val="Titre3"/>
+      <w:pStyle w:val="Heading3"/>
       <w:spacing w:line="240" w:lineRule="auto"/>
       <w:ind w:right="6804"/>
       <w:rPr>
@@ -3616,7 +3141,7 @@
   </w:p>
   <w:p>
     <w:pPr>
-      <w:pStyle w:val="Titre3"/>
+      <w:pStyle w:val="Heading3"/>
       <w:spacing w:line="240" w:lineRule="auto"/>
       <w:ind w:right="6804"/>
       <w:rPr>
@@ -3627,7 +3152,6 @@
         <w:rtl/>
       </w:rPr>
     </w:pPr>
-    <w:proofErr w:type="gramStart"/>
     <w:r>
       <w:rPr>
         <w:rFonts w:cs="Traditional Arabic"/>
@@ -3638,7 +3162,6 @@
       </w:rPr>
       <w:t>المديرية  الإقليمية</w:t>
     </w:r>
-    <w:proofErr w:type="gramEnd"/>
     <w:r>
       <w:rPr>
         <w:rFonts w:cs="Traditional Arabic" w:hint="cs"/>
@@ -3652,9 +3175,17 @@
   </w:p>
   <w:p>
     <w:pPr>
-      <w:pStyle w:val="Titre3"/>
+      <w:pStyle w:val="Heading3"/>
       <w:spacing w:line="240" w:lineRule="auto"/>
       <w:ind w:right="6804"/>
+      <w:rPr>
+        <w:rFonts w:cs="Traditional Arabic"/>
+        <w:sz w:val="24"/>
+        <w:szCs w:val="24"/>
+        <w:u w:val="none"/>
+      </w:rPr>
+    </w:pPr>
+    <w:r>
       <w:rPr>
         <w:rFonts w:cs="Traditional Arabic"/>
         <w:sz w:val="24"/>
@@ -3662,16 +3193,60 @@
         <w:u w:val="none"/>
         <w:rtl/>
       </w:rPr>
+      <w:t>بالجديدة</w:t>
+    </w:r>
+  </w:p>
+  <w:p>
+    <w:pPr>
+      <w:pStyle w:val="Heading3"/>
+      <w:ind w:left="360" w:right="-450" w:firstLine="7684"/>
+      <w:rPr>
+        <w:rFonts w:cs="Traditional Arabic"/>
+        <w:rtl/>
+        <w:lang w:val="fr-FR"/>
+      </w:rPr>
     </w:pPr>
     <w:r>
       <w:rPr>
-        <w:rFonts w:cs="Traditional Arabic"/>
+        <w:rFonts w:cs="Traditional Arabic" w:hint="cs"/>
         <w:sz w:val="24"/>
         <w:szCs w:val="24"/>
         <w:u w:val="none"/>
         <w:rtl/>
       </w:rPr>
-      <w:t>بالجديدة</w:t>
+      <w:t xml:space="preserve">الجديدة في : </w:t>
+    </w:r>
+    <w:r>
+      <w:rPr>
+        <w:rFonts w:cs="Traditional Arabic"/>
+        <w:sz w:val="20"/>
+        <w:szCs w:val="20"/>
+        <w:u w:val="none"/>
+        <w:lang w:val="fr-FR"/>
+      </w:rPr>
+      <w:t>{</w:t>
+    </w:r>
+    <w:proofErr w:type="spellStart"/>
+    <w:r>
+      <w:rPr>
+        <w:rFonts w:cs="Traditional Arabic"/>
+        <w:sz w:val="20"/>
+        <w:szCs w:val="20"/>
+        <w:u w:val="none"/>
+        <w:lang w:val="fr-FR"/>
+      </w:rPr>
+      <w:t>dateCreation</w:t>
+    </w:r>
+    <w:proofErr w:type="spellEnd"/>
+    <w:r>
+      <w:rPr>
+        <w:rFonts w:cs="Traditional Arabic"/>
+        <w:sz w:val="20"/>
+        <w:szCs w:val="20"/>
+        <w:u w:val="none"/>
+        <w:lang w:val="fr-FR"/>
+      </w:rPr>
+      <w:t>}</w:t>
     </w:r>
   </w:p>
 </w:hdr>
@@ -4707,11 +4282,11 @@
       <w:lang w:eastAsia="ar-SA"/>
     </w:rPr>
   </w:style>
-  <w:style w:type="paragraph" w:styleId="Titre3">
+  <w:style w:type="paragraph" w:styleId="Heading3">
     <w:name w:val="heading 3"/>
     <w:basedOn w:val="Normal"/>
     <w:next w:val="Normal"/>
-    <w:link w:val="Titre3Car"/>
+    <w:link w:val="Heading3Char"/>
     <w:qFormat/>
     <w:rsid w:val="00BC685B"/>
     <w:pPr>
@@ -4734,12 +4309,13 @@
       <w:lang w:bidi="ar-MA"/>
     </w:rPr>
   </w:style>
-  <w:style w:type="character" w:default="1" w:styleId="Policepardfaut">
+  <w:style w:type="character" w:default="1" w:styleId="DefaultParagraphFont">
     <w:name w:val="Default Paragraph Font"/>
     <w:uiPriority w:val="1"/>
+    <w:semiHidden/>
     <w:unhideWhenUsed/>
   </w:style>
-  <w:style w:type="table" w:default="1" w:styleId="TableauNormal">
+  <w:style w:type="table" w:default="1" w:styleId="TableNormal">
     <w:name w:val="Normal Table"/>
     <w:uiPriority w:val="99"/>
     <w:semiHidden/>
@@ -4754,16 +4330,16 @@
       </w:tblCellMar>
     </w:tblPr>
   </w:style>
-  <w:style w:type="numbering" w:default="1" w:styleId="Aucuneliste">
+  <w:style w:type="numbering" w:default="1" w:styleId="NoList">
     <w:name w:val="No List"/>
     <w:uiPriority w:val="99"/>
     <w:semiHidden/>
     <w:unhideWhenUsed/>
   </w:style>
-  <w:style w:type="character" w:customStyle="1" w:styleId="Titre3Car">
-    <w:name w:val="Titre 3 Car"/>
-    <w:basedOn w:val="Policepardfaut"/>
-    <w:link w:val="Titre3"/>
+  <w:style w:type="character" w:customStyle="1" w:styleId="Heading3Char">
+    <w:name w:val="Heading 3 Char"/>
+    <w:basedOn w:val="DefaultParagraphFont"/>
+    <w:link w:val="Heading3"/>
     <w:rsid w:val="00BC685B"/>
     <w:rPr>
       <w:rFonts w:ascii="Times New Roman" w:eastAsia="Times New Roman" w:hAnsi="Times New Roman" w:cs="Times New Roman"/>
@@ -4775,10 +4351,10 @@
       <w:lang w:eastAsia="ar-SA" w:bidi="ar-MA"/>
     </w:rPr>
   </w:style>
-  <w:style w:type="paragraph" w:styleId="Textedebulles">
+  <w:style w:type="paragraph" w:styleId="BalloonText">
     <w:name w:val="Balloon Text"/>
     <w:basedOn w:val="Normal"/>
-    <w:link w:val="TextedebullesCar"/>
+    <w:link w:val="BalloonTextChar"/>
     <w:uiPriority w:val="99"/>
     <w:semiHidden/>
     <w:unhideWhenUsed/>
@@ -4789,10 +4365,10 @@
       <w:szCs w:val="16"/>
     </w:rPr>
   </w:style>
-  <w:style w:type="character" w:customStyle="1" w:styleId="TextedebullesCar">
-    <w:name w:val="Texte de bulles Car"/>
-    <w:basedOn w:val="Policepardfaut"/>
-    <w:link w:val="Textedebulles"/>
+  <w:style w:type="character" w:customStyle="1" w:styleId="BalloonTextChar">
+    <w:name w:val="Balloon Text Char"/>
+    <w:basedOn w:val="DefaultParagraphFont"/>
+    <w:link w:val="BalloonText"/>
     <w:uiPriority w:val="99"/>
     <w:semiHidden/>
     <w:rsid w:val="00BC685B"/>
@@ -4803,10 +4379,10 @@
       <w:lang w:eastAsia="ar-SA"/>
     </w:rPr>
   </w:style>
-  <w:style w:type="paragraph" w:styleId="En-tte">
+  <w:style w:type="paragraph" w:styleId="Header">
     <w:name w:val="header"/>
     <w:basedOn w:val="Normal"/>
-    <w:link w:val="En-tteCar"/>
+    <w:link w:val="HeaderChar"/>
     <w:uiPriority w:val="99"/>
     <w:unhideWhenUsed/>
     <w:rsid w:val="00E871BF"/>
@@ -4817,10 +4393,10 @@
       </w:tabs>
     </w:pPr>
   </w:style>
-  <w:style w:type="character" w:customStyle="1" w:styleId="En-tteCar">
-    <w:name w:val="En-tête Car"/>
-    <w:basedOn w:val="Policepardfaut"/>
-    <w:link w:val="En-tte"/>
+  <w:style w:type="character" w:customStyle="1" w:styleId="HeaderChar">
+    <w:name w:val="Header Char"/>
+    <w:basedOn w:val="DefaultParagraphFont"/>
+    <w:link w:val="Header"/>
     <w:uiPriority w:val="99"/>
     <w:rsid w:val="00E871BF"/>
     <w:rPr>
@@ -4830,10 +4406,10 @@
       <w:lang w:eastAsia="ar-SA"/>
     </w:rPr>
   </w:style>
-  <w:style w:type="paragraph" w:styleId="Pieddepage">
+  <w:style w:type="paragraph" w:styleId="Footer">
     <w:name w:val="footer"/>
     <w:basedOn w:val="Normal"/>
-    <w:link w:val="PieddepageCar"/>
+    <w:link w:val="FooterChar"/>
     <w:uiPriority w:val="99"/>
     <w:unhideWhenUsed/>
     <w:rsid w:val="00E871BF"/>
@@ -4844,10 +4420,10 @@
       </w:tabs>
     </w:pPr>
   </w:style>
-  <w:style w:type="character" w:customStyle="1" w:styleId="PieddepageCar">
-    <w:name w:val="Pied de page Car"/>
-    <w:basedOn w:val="Policepardfaut"/>
-    <w:link w:val="Pieddepage"/>
+  <w:style w:type="character" w:customStyle="1" w:styleId="FooterChar">
+    <w:name w:val="Footer Char"/>
+    <w:basedOn w:val="DefaultParagraphFont"/>
+    <w:link w:val="Footer"/>
     <w:uiPriority w:val="99"/>
     <w:rsid w:val="00E871BF"/>
     <w:rPr>
@@ -4857,7 +4433,7 @@
       <w:lang w:eastAsia="ar-SA"/>
     </w:rPr>
   </w:style>
-  <w:style w:type="paragraph" w:styleId="Paragraphedeliste">
+  <w:style w:type="paragraph" w:styleId="ListParagraph">
     <w:name w:val="List Paragraph"/>
     <w:basedOn w:val="Normal"/>
     <w:uiPriority w:val="34"/>
@@ -4875,9 +4451,9 @@
       <w:lang w:eastAsia="en-US"/>
     </w:rPr>
   </w:style>
-  <w:style w:type="table" w:styleId="Grilledutableau">
+  <w:style w:type="table" w:styleId="TableGrid">
     <w:name w:val="Table Grid"/>
-    <w:basedOn w:val="TableauNormal"/>
+    <w:basedOn w:val="TableNormal"/>
     <w:uiPriority w:val="59"/>
     <w:rsid w:val="00130830"/>
     <w:pPr>

</xml_diff>